<commit_message>
Final Problem Upload with Finished Report
</commit_message>
<xml_diff>
--- a/HW3/IrrigationOperationReport.docx
+++ b/HW3/IrrigationOperationReport.docx
@@ -443,15 +443,7 @@
     </w:p>
     <w:p>
       <w:pPr>
-        <w:spacing w:after="0"/>
-        <w:rPr>
-          <w:rFonts w:ascii="Times New Roman" w:hAnsi="Times New Roman" w:cs="Times New Roman"/>
-        </w:rPr>
-      </w:pPr>
-    </w:p>
-    <w:p>
-      <w:pPr>
-        <w:spacing w:after="0"/>
+        <w:spacing w:before="120" w:after="0"/>
         <w:rPr>
           <w:rFonts w:ascii="Times New Roman" w:hAnsi="Times New Roman" w:cs="Times New Roman"/>
           <w:b/>
@@ -478,13 +470,19 @@
         <w:rPr>
           <w:rFonts w:ascii="Times New Roman" w:hAnsi="Times New Roman" w:cs="Times New Roman"/>
         </w:rPr>
-        <w:t>The dimension of thi</w:t>
-      </w:r>
-      <w:r>
-        <w:rPr>
-          <w:rFonts w:ascii="Times New Roman" w:hAnsi="Times New Roman" w:cs="Times New Roman"/>
-        </w:rPr>
-        <w:t xml:space="preserve">s model are </w:t>
+        <w:t>The dimension of th</w:t>
+      </w:r>
+      <w:r>
+        <w:rPr>
+          <w:rFonts w:ascii="Times New Roman" w:hAnsi="Times New Roman" w:cs="Times New Roman"/>
+        </w:rPr>
+        <w:t>e</w:t>
+      </w:r>
+      <w:r>
+        <w:rPr>
+          <w:rFonts w:ascii="Times New Roman" w:hAnsi="Times New Roman" w:cs="Times New Roman"/>
+        </w:rPr>
+        <w:t xml:space="preserve"> model are </w:t>
       </w:r>
       <w:r>
         <w:rPr>
@@ -544,13 +542,13 @@
         <w:rPr>
           <w:rFonts w:ascii="Times New Roman" w:hAnsi="Times New Roman" w:cs="Times New Roman"/>
         </w:rPr>
-        <w:t xml:space="preserve">is at </w:t>
-      </w:r>
-      <w:r>
-        <w:rPr>
-          <w:rFonts w:ascii="Times New Roman" w:hAnsi="Times New Roman" w:cs="Times New Roman"/>
-        </w:rPr>
-        <w:t xml:space="preserve">each </w:t>
+        <w:t>should go to each</w:t>
+      </w:r>
+      <w:r>
+        <w:rPr>
+          <w:rFonts w:ascii="Times New Roman" w:hAnsi="Times New Roman" w:cs="Times New Roman"/>
+        </w:rPr>
+        <w:t xml:space="preserve"> </w:t>
       </w:r>
       <w:r>
         <w:rPr>
@@ -644,7 +642,19 @@
         <w:rPr>
           <w:rFonts w:ascii="Times New Roman" w:hAnsi="Times New Roman" w:cs="Times New Roman"/>
         </w:rPr>
-        <w:t>The objective function is to maximize profit</w:t>
+        <w:t xml:space="preserve">The objective function </w:t>
+      </w:r>
+      <w:r>
+        <w:rPr>
+          <w:rFonts w:ascii="Times New Roman" w:hAnsi="Times New Roman" w:cs="Times New Roman"/>
+        </w:rPr>
+        <w:t xml:space="preserve">maximizes </w:t>
+      </w:r>
+      <w:r>
+        <w:rPr>
+          <w:rFonts w:ascii="Times New Roman" w:hAnsi="Times New Roman" w:cs="Times New Roman"/>
+        </w:rPr>
+        <w:t>profit</w:t>
       </w:r>
       <w:r>
         <w:rPr>
@@ -792,31 +802,7 @@
                 <w:sz w:val="22"/>
                 <w:szCs w:val="22"/>
               </w:rPr>
-              <m:t>)*X(Div</m:t>
-            </m:r>
-            <m:r>
-              <w:rPr>
-                <w:rFonts w:ascii="Cambria Math" w:hAnsi="Cambria Math" w:cs="Times New Roman"/>
-                <w:sz w:val="22"/>
-                <w:szCs w:val="22"/>
-              </w:rPr>
-              <m:t>ersion</m:t>
-            </m:r>
-            <m:r>
-              <w:rPr>
-                <w:rFonts w:ascii="Cambria Math" w:hAnsi="Cambria Math" w:cs="Times New Roman"/>
-                <w:sz w:val="22"/>
-                <w:szCs w:val="22"/>
-              </w:rPr>
-              <m:t xml:space="preserve"> </m:t>
-            </m:r>
-            <m:r>
-              <w:rPr>
-                <w:rFonts w:ascii="Cambria Math" w:hAnsi="Cambria Math" w:cs="Times New Roman"/>
-                <w:sz w:val="22"/>
-                <w:szCs w:val="22"/>
-              </w:rPr>
-              <m:t>,</m:t>
+              <m:t>)*X(Diversion ,</m:t>
             </m:r>
             <m:sSub>
               <m:sSubPr>
@@ -911,7 +897,7 @@
         <w:rPr>
           <w:rFonts w:ascii="Times New Roman" w:eastAsiaTheme="minorEastAsia" w:hAnsi="Times New Roman" w:cs="Times New Roman"/>
         </w:rPr>
-        <w:t>listed below with the corresponding mathematical equation and units:</w:t>
+        <w:t>listed with the corresponding mathematical equation and units:</w:t>
       </w:r>
       <w:r>
         <w:rPr>
@@ -919,20 +905,6 @@
         </w:rPr>
         <w:t xml:space="preserve"> </w:t>
       </w:r>
-    </w:p>
-    <w:p>
-      <w:pPr>
-        <w:pStyle w:val="ListParagraph"/>
-        <w:numPr>
-          <w:ilvl w:val="0"/>
-          <w:numId w:val="2"/>
-        </w:numPr>
-        <w:spacing w:after="0"/>
-        <w:ind w:left="540"/>
-        <w:rPr>
-          <w:rFonts w:ascii="Times New Roman" w:eastAsiaTheme="minorEastAsia" w:hAnsi="Times New Roman" w:cs="Times New Roman"/>
-        </w:rPr>
-      </w:pPr>
       <w:r>
         <w:rPr>
           <w:rFonts w:ascii="Times New Roman" w:eastAsiaTheme="minorEastAsia" w:hAnsi="Times New Roman" w:cs="Times New Roman"/>
@@ -967,7 +939,7 @@
         <w:rPr>
           <w:rFonts w:ascii="Times New Roman" w:eastAsiaTheme="minorEastAsia" w:hAnsi="Times New Roman" w:cs="Times New Roman"/>
         </w:rPr>
-        <w:t>.</w:t>
+        <w:t>,</w:t>
       </w:r>
       <w:r>
         <w:rPr>
@@ -1031,27 +1003,25 @@
           <w:sz w:val="22"/>
           <w:szCs w:val="22"/>
         </w:rPr>
+        <w:t xml:space="preserve">. </w:t>
+      </w:r>
+      <w:r>
+        <w:rPr>
+          <w:rFonts w:ascii="Times New Roman" w:eastAsiaTheme="minorEastAsia" w:hAnsi="Times New Roman" w:cs="Times New Roman"/>
+        </w:rPr>
+        <w:t>The max capacity of the reservoir is 9000 ac-ft</w:t>
+      </w:r>
+      <w:r>
+        <w:rPr>
+          <w:rFonts w:ascii="Times New Roman" w:eastAsiaTheme="minorEastAsia" w:hAnsi="Times New Roman" w:cs="Times New Roman"/>
+        </w:rPr>
+        <w:t>,</w:t>
+      </w:r>
+      <w:r>
+        <w:rPr>
+          <w:rFonts w:ascii="Times New Roman" w:eastAsiaTheme="minorEastAsia" w:hAnsi="Times New Roman" w:cs="Times New Roman"/>
+        </w:rPr>
         <w:t xml:space="preserve"> </w:t>
-      </w:r>
-    </w:p>
-    <w:p>
-      <w:pPr>
-        <w:pStyle w:val="ListParagraph"/>
-        <w:numPr>
-          <w:ilvl w:val="0"/>
-          <w:numId w:val="2"/>
-        </w:numPr>
-        <w:spacing w:after="0"/>
-        <w:ind w:left="540"/>
-        <w:rPr>
-          <w:rFonts w:ascii="Times New Roman" w:eastAsiaTheme="minorEastAsia" w:hAnsi="Times New Roman" w:cs="Times New Roman"/>
-        </w:rPr>
-      </w:pPr>
-      <w:r>
-        <w:rPr>
-          <w:rFonts w:ascii="Times New Roman" w:eastAsiaTheme="minorEastAsia" w:hAnsi="Times New Roman" w:cs="Times New Roman"/>
-        </w:rPr>
-        <w:t xml:space="preserve">The max capacity of the reservoir is 9000 ac-ft. </w:t>
       </w:r>
       <m:oMath>
         <m:r>
@@ -1120,31 +1090,15 @@
             <w:sz w:val="22"/>
             <w:szCs w:val="22"/>
           </w:rPr>
-          <m:t>&lt;=9000,</m:t>
-        </m:r>
-        <m:r>
-          <w:rPr>
-            <w:rFonts w:ascii="Cambria Math" w:eastAsiaTheme="minorEastAsia" w:hAnsi="Cambria Math" w:cs="Times New Roman"/>
-            <w:sz w:val="22"/>
-            <w:szCs w:val="22"/>
-          </w:rPr>
-          <m:t xml:space="preserve"> [ac-ft]</m:t>
+          <m:t>&lt;=9000, [ac-ft]</m:t>
         </m:r>
       </m:oMath>
-    </w:p>
-    <w:p>
-      <w:pPr>
-        <w:pStyle w:val="ListParagraph"/>
-        <w:numPr>
-          <w:ilvl w:val="0"/>
-          <w:numId w:val="2"/>
-        </w:numPr>
-        <w:spacing w:after="0"/>
-        <w:ind w:left="540"/>
-        <w:rPr>
-          <w:rFonts w:ascii="Times New Roman" w:eastAsiaTheme="minorEastAsia" w:hAnsi="Times New Roman" w:cs="Times New Roman"/>
-        </w:rPr>
-      </w:pPr>
+      <w:r>
+        <w:rPr>
+          <w:rFonts w:ascii="Times New Roman" w:eastAsiaTheme="minorEastAsia" w:hAnsi="Times New Roman" w:cs="Times New Roman"/>
+        </w:rPr>
+        <w:t xml:space="preserve">. </w:t>
+      </w:r>
       <w:r>
         <w:rPr>
           <w:rFonts w:ascii="Times New Roman" w:eastAsiaTheme="minorEastAsia" w:hAnsi="Times New Roman" w:cs="Times New Roman"/>
@@ -1171,19 +1125,7 @@
               <w:rPr>
                 <w:rFonts w:ascii="Cambria Math" w:eastAsiaTheme="minorEastAsia" w:hAnsi="Cambria Math" w:cs="Times New Roman"/>
               </w:rPr>
-              <m:t>Sto</m:t>
-            </m:r>
-            <m:r>
-              <w:rPr>
-                <w:rFonts w:ascii="Cambria Math" w:eastAsiaTheme="minorEastAsia" w:hAnsi="Cambria Math" w:cs="Times New Roman"/>
-              </w:rPr>
-              <m:t>r</m:t>
-            </m:r>
-            <m:r>
-              <w:rPr>
-                <w:rFonts w:ascii="Cambria Math" w:eastAsiaTheme="minorEastAsia" w:hAnsi="Cambria Math" w:cs="Times New Roman"/>
-              </w:rPr>
-              <m:t>.,</m:t>
+              <m:t>Stor.,</m:t>
             </m:r>
             <m:sSub>
               <m:sSubPr>
@@ -1231,19 +1173,7 @@
               <w:rPr>
                 <w:rFonts w:ascii="Cambria Math" w:eastAsiaTheme="minorEastAsia" w:hAnsi="Cambria Math" w:cs="Times New Roman"/>
               </w:rPr>
-              <m:t>Sto</m:t>
-            </m:r>
-            <m:r>
-              <w:rPr>
-                <w:rFonts w:ascii="Cambria Math" w:eastAsiaTheme="minorEastAsia" w:hAnsi="Cambria Math" w:cs="Times New Roman"/>
-              </w:rPr>
-              <m:t>r</m:t>
-            </m:r>
-            <m:r>
-              <w:rPr>
-                <w:rFonts w:ascii="Cambria Math" w:eastAsiaTheme="minorEastAsia" w:hAnsi="Cambria Math" w:cs="Times New Roman"/>
-              </w:rPr>
-              <m:t>.,</m:t>
+              <m:t>Stor.,</m:t>
             </m:r>
             <m:sSub>
               <m:sSubPr>
@@ -1415,24 +1345,10 @@
         </w:rPr>
         <w:t>. (Note: inflows are shown in Table 2)</w:t>
       </w:r>
-      <w:r>
-        <w:rPr>
-          <w:rFonts w:ascii="Times New Roman" w:eastAsiaTheme="minorEastAsia" w:hAnsi="Times New Roman" w:cs="Times New Roman"/>
-        </w:rPr>
-        <w:t>---</w:t>
-      </w:r>
-    </w:p>
-    <w:p>
-      <w:pPr>
-        <w:spacing w:after="0"/>
-        <w:rPr>
-          <w:rFonts w:ascii="Times New Roman" w:eastAsiaTheme="minorEastAsia" w:hAnsi="Times New Roman" w:cs="Times New Roman"/>
-        </w:rPr>
-      </w:pPr>
-    </w:p>
-    <w:p>
-      <w:pPr>
-        <w:spacing w:after="0"/>
+    </w:p>
+    <w:p>
+      <w:pPr>
+        <w:spacing w:before="120" w:after="0"/>
         <w:rPr>
           <w:rFonts w:ascii="Times New Roman" w:eastAsiaTheme="minorEastAsia" w:hAnsi="Times New Roman" w:cs="Times New Roman"/>
           <w:b/>
@@ -1495,13 +1411,43 @@
         <w:rPr>
           <w:rFonts w:ascii="Times New Roman" w:hAnsi="Times New Roman" w:cs="Times New Roman"/>
         </w:rPr>
-        <w:t xml:space="preserve">found the optimal solution after programing the model formulation. </w:t>
-      </w:r>
-      <w:r>
-        <w:rPr>
-          <w:rFonts w:ascii="Times New Roman" w:hAnsi="Times New Roman" w:cs="Times New Roman"/>
-        </w:rPr>
-        <w:t>Table 3 contains the diversion schedule</w:t>
+        <w:t>found the optimal solution</w:t>
+      </w:r>
+      <w:r>
+        <w:rPr>
+          <w:rFonts w:ascii="Times New Roman" w:hAnsi="Times New Roman" w:cs="Times New Roman"/>
+        </w:rPr>
+        <w:t xml:space="preserve"> that provides the </w:t>
+      </w:r>
+      <w:r>
+        <w:rPr>
+          <w:rFonts w:ascii="Times New Roman" w:hAnsi="Times New Roman" w:cs="Times New Roman"/>
+        </w:rPr>
+        <w:t>maximum profit</w:t>
+      </w:r>
+      <w:r>
+        <w:rPr>
+          <w:rFonts w:ascii="Times New Roman" w:hAnsi="Times New Roman" w:cs="Times New Roman"/>
+        </w:rPr>
+        <w:t xml:space="preserve">. </w:t>
+      </w:r>
+      <w:r>
+        <w:rPr>
+          <w:rFonts w:ascii="Times New Roman" w:hAnsi="Times New Roman" w:cs="Times New Roman"/>
+        </w:rPr>
+        <w:t xml:space="preserve">Table 3 contains the </w:t>
+      </w:r>
+      <w:r>
+        <w:rPr>
+          <w:rFonts w:ascii="Times New Roman" w:hAnsi="Times New Roman" w:cs="Times New Roman"/>
+        </w:rPr>
+        <w:t xml:space="preserve">optimal </w:t>
+      </w:r>
+      <w:r>
+        <w:rPr>
+          <w:rFonts w:ascii="Times New Roman" w:hAnsi="Times New Roman" w:cs="Times New Roman"/>
+        </w:rPr>
+        <w:t>diversion schedule</w:t>
       </w:r>
       <w:r>
         <w:rPr>
@@ -1632,7 +1578,7 @@
     </w:p>
     <w:p>
       <w:pPr>
-        <w:spacing w:after="0"/>
+        <w:spacing w:before="120" w:after="0"/>
         <w:rPr>
           <w:rFonts w:ascii="Times New Roman" w:eastAsiaTheme="minorEastAsia" w:hAnsi="Times New Roman" w:cs="Times New Roman"/>
           <w:b/>
@@ -1653,6 +1599,110 @@
         <w:spacing w:after="0"/>
         <w:rPr>
           <w:rFonts w:ascii="Times New Roman" w:eastAsiaTheme="minorEastAsia" w:hAnsi="Times New Roman" w:cs="Times New Roman"/>
+        </w:rPr>
+      </w:pPr>
+      <w:r>
+        <w:rPr>
+          <w:rFonts w:ascii="Times New Roman" w:eastAsiaTheme="minorEastAsia" w:hAnsi="Times New Roman" w:cs="Times New Roman"/>
+        </w:rPr>
+        <w:t xml:space="preserve">The </w:t>
+      </w:r>
+      <w:r>
+        <w:rPr>
+          <w:rFonts w:ascii="Times New Roman" w:eastAsiaTheme="minorEastAsia" w:hAnsi="Times New Roman" w:cs="Times New Roman"/>
+        </w:rPr>
+        <w:t xml:space="preserve">diversion schedule is optimal because the most water diverted is in the last month and </w:t>
+      </w:r>
+      <w:r>
+        <w:rPr>
+          <w:rFonts w:ascii="Times New Roman" w:eastAsiaTheme="minorEastAsia" w:hAnsi="Times New Roman" w:cs="Times New Roman"/>
+        </w:rPr>
+        <w:t>none of</w:t>
+      </w:r>
+      <w:r>
+        <w:rPr>
+          <w:rFonts w:ascii="Times New Roman" w:eastAsiaTheme="minorEastAsia" w:hAnsi="Times New Roman" w:cs="Times New Roman"/>
+        </w:rPr>
+        <w:t xml:space="preserve"> the water </w:t>
+      </w:r>
+      <w:r>
+        <w:rPr>
+          <w:rFonts w:ascii="Times New Roman" w:eastAsiaTheme="minorEastAsia" w:hAnsi="Times New Roman" w:cs="Times New Roman"/>
+        </w:rPr>
+        <w:t xml:space="preserve">goes on the spillway to the river. </w:t>
+      </w:r>
+      <w:r>
+        <w:rPr>
+          <w:rFonts w:ascii="Times New Roman" w:eastAsiaTheme="minorEastAsia" w:hAnsi="Times New Roman" w:cs="Times New Roman"/>
+        </w:rPr>
+        <w:t>All wat</w:t>
+      </w:r>
+      <w:r>
+        <w:rPr>
+          <w:rFonts w:ascii="Times New Roman" w:eastAsiaTheme="minorEastAsia" w:hAnsi="Times New Roman" w:cs="Times New Roman"/>
+        </w:rPr>
+        <w:t xml:space="preserve">er contributes the most profit possible. </w:t>
+      </w:r>
+      <w:r>
+        <w:rPr>
+          <w:rFonts w:ascii="Times New Roman" w:eastAsiaTheme="minorEastAsia" w:hAnsi="Times New Roman" w:cs="Times New Roman"/>
+        </w:rPr>
+        <w:t>Th</w:t>
+      </w:r>
+      <w:r>
+        <w:rPr>
+          <w:rFonts w:ascii="Times New Roman" w:eastAsiaTheme="minorEastAsia" w:hAnsi="Times New Roman" w:cs="Times New Roman"/>
+        </w:rPr>
+        <w:t>is problem helped grow my understanding on model formulation; specifically</w:t>
+      </w:r>
+      <w:r>
+        <w:rPr>
+          <w:rFonts w:ascii="Times New Roman" w:eastAsiaTheme="minorEastAsia" w:hAnsi="Times New Roman" w:cs="Times New Roman"/>
+        </w:rPr>
+        <w:t>,</w:t>
+      </w:r>
+      <w:r>
+        <w:rPr>
+          <w:rFonts w:ascii="Times New Roman" w:eastAsiaTheme="minorEastAsia" w:hAnsi="Times New Roman" w:cs="Times New Roman"/>
+        </w:rPr>
+        <w:t xml:space="preserve"> how to mathematically express the model. </w:t>
+      </w:r>
+      <w:r>
+        <w:rPr>
+          <w:rFonts w:ascii="Times New Roman" w:eastAsiaTheme="minorEastAsia" w:hAnsi="Times New Roman" w:cs="Times New Roman"/>
+        </w:rPr>
+        <w:t xml:space="preserve">This model does not </w:t>
+      </w:r>
+      <w:r>
+        <w:rPr>
+          <w:rFonts w:ascii="Times New Roman" w:eastAsiaTheme="minorEastAsia" w:hAnsi="Times New Roman" w:cs="Times New Roman"/>
+        </w:rPr>
+        <w:t>consider</w:t>
+      </w:r>
+      <w:r>
+        <w:rPr>
+          <w:rFonts w:ascii="Times New Roman" w:eastAsiaTheme="minorEastAsia" w:hAnsi="Times New Roman" w:cs="Times New Roman"/>
+        </w:rPr>
+        <w:t xml:space="preserve"> the </w:t>
+      </w:r>
+      <w:r>
+        <w:rPr>
+          <w:rFonts w:ascii="Times New Roman" w:eastAsiaTheme="minorEastAsia" w:hAnsi="Times New Roman" w:cs="Times New Roman"/>
+        </w:rPr>
+        <w:t>demand of farmers</w:t>
+      </w:r>
+      <w:r>
+        <w:rPr>
+          <w:rFonts w:ascii="Times New Roman" w:eastAsiaTheme="minorEastAsia" w:hAnsi="Times New Roman" w:cs="Times New Roman"/>
+        </w:rPr>
+        <w:t xml:space="preserve"> which might be a concern for the company manager. </w:t>
+      </w:r>
+    </w:p>
+    <w:p>
+      <w:pPr>
+        <w:spacing w:before="120" w:after="0"/>
+        <w:rPr>
+          <w:rFonts w:ascii="Times New Roman" w:eastAsiaTheme="minorEastAsia" w:hAnsi="Times New Roman" w:cs="Times New Roman"/>
           <w:b/>
           <w:bCs/>
         </w:rPr>
@@ -1673,6 +1723,48 @@
           <w:rFonts w:ascii="Times New Roman" w:hAnsi="Times New Roman" w:cs="Times New Roman"/>
         </w:rPr>
       </w:pPr>
+      <w:r>
+        <w:rPr>
+          <w:rFonts w:ascii="Times New Roman" w:hAnsi="Times New Roman" w:cs="Times New Roman"/>
+        </w:rPr>
+        <w:t>In conclusion by following the optimal diversion schedule the profit will be $3,</w:t>
+      </w:r>
+      <w:r>
+        <w:rPr>
+          <w:rFonts w:ascii="Times New Roman" w:hAnsi="Times New Roman" w:cs="Times New Roman"/>
+        </w:rPr>
+        <w:t xml:space="preserve">774,000. This is the maximum profit based on the </w:t>
+      </w:r>
+      <w:r>
+        <w:rPr>
+          <w:rFonts w:ascii="Times New Roman" w:hAnsi="Times New Roman" w:cs="Times New Roman"/>
+        </w:rPr>
+        <w:t>constraints</w:t>
+      </w:r>
+      <w:r>
+        <w:rPr>
+          <w:rFonts w:ascii="Times New Roman" w:hAnsi="Times New Roman" w:cs="Times New Roman"/>
+        </w:rPr>
+        <w:t xml:space="preserve"> and </w:t>
+      </w:r>
+      <w:r>
+        <w:rPr>
+          <w:rFonts w:ascii="Times New Roman" w:hAnsi="Times New Roman" w:cs="Times New Roman"/>
+        </w:rPr>
+        <w:t>information</w:t>
+      </w:r>
+      <w:r>
+        <w:rPr>
+          <w:rFonts w:ascii="Times New Roman" w:hAnsi="Times New Roman" w:cs="Times New Roman"/>
+        </w:rPr>
+        <w:t xml:space="preserve"> given. </w:t>
+      </w:r>
+      <w:r>
+        <w:rPr>
+          <w:rFonts w:ascii="Times New Roman" w:hAnsi="Times New Roman" w:cs="Times New Roman"/>
+        </w:rPr>
+        <w:t xml:space="preserve">GAMS programing and modeling software was used to find the solution to the problem. </w:t>
+      </w:r>
     </w:p>
     <w:p>
       <w:pPr>
@@ -1693,7 +1785,7 @@
         <w:rPr>
           <w:rFonts w:ascii="Times New Roman" w:hAnsi="Times New Roman" w:cs="Times New Roman"/>
         </w:rPr>
-        <w:t>C. Solution - Delivery schedule, Objective Function value, Constraints that</w:t>
+        <w:br w:type="page"/>
       </w:r>
     </w:p>
     <w:p>
@@ -1701,13 +1793,18 @@
         <w:spacing w:after="0"/>
         <w:rPr>
           <w:rFonts w:ascii="Times New Roman" w:hAnsi="Times New Roman" w:cs="Times New Roman"/>
-        </w:rPr>
-      </w:pPr>
-      <w:r>
-        <w:rPr>
-          <w:rFonts w:ascii="Times New Roman" w:hAnsi="Times New Roman" w:cs="Times New Roman"/>
-        </w:rPr>
-        <w:t>bind and that are slack [15 points]</w:t>
+          <w:b/>
+          <w:bCs/>
+        </w:rPr>
+      </w:pPr>
+      <w:r>
+        <w:rPr>
+          <w:rFonts w:ascii="Times New Roman" w:hAnsi="Times New Roman" w:cs="Times New Roman"/>
+          <w:b/>
+          <w:bCs/>
+        </w:rPr>
+        <w:lastRenderedPageBreak/>
+        <w:t>Appendix A – Tables</w:t>
       </w:r>
     </w:p>
     <w:p>
@@ -1715,53 +1812,895 @@
         <w:spacing w:after="0"/>
         <w:rPr>
           <w:rFonts w:ascii="Times New Roman" w:hAnsi="Times New Roman" w:cs="Times New Roman"/>
-        </w:rPr>
-      </w:pPr>
-      <w:r>
-        <w:rPr>
-          <w:rFonts w:ascii="Times New Roman" w:hAnsi="Times New Roman" w:cs="Times New Roman"/>
-        </w:rPr>
-        <w:t>D. Explain why the optimal solution is optimal, new insights you took away</w:t>
-      </w:r>
-    </w:p>
+          <w:b/>
+          <w:bCs/>
+          <w:sz w:val="28"/>
+          <w:szCs w:val="28"/>
+        </w:rPr>
+      </w:pPr>
+    </w:p>
+    <w:p>
+      <w:pPr>
+        <w:pStyle w:val="Caption"/>
+        <w:keepNext/>
+        <w:jc w:val="center"/>
+        <w:rPr>
+          <w:rFonts w:ascii="Times New Roman" w:hAnsi="Times New Roman" w:cs="Times New Roman"/>
+          <w:color w:val="000000" w:themeColor="text1"/>
+        </w:rPr>
+      </w:pPr>
+      <w:r>
+        <w:rPr>
+          <w:rFonts w:ascii="Times New Roman" w:hAnsi="Times New Roman" w:cs="Times New Roman"/>
+          <w:color w:val="000000" w:themeColor="text1"/>
+        </w:rPr>
+        <w:t xml:space="preserve">Table </w:t>
+      </w:r>
+      <w:r>
+        <w:rPr>
+          <w:rFonts w:ascii="Times New Roman" w:hAnsi="Times New Roman" w:cs="Times New Roman"/>
+          <w:color w:val="000000" w:themeColor="text1"/>
+        </w:rPr>
+        <w:fldChar w:fldCharType="begin"/>
+      </w:r>
+      <w:r>
+        <w:rPr>
+          <w:rFonts w:ascii="Times New Roman" w:hAnsi="Times New Roman" w:cs="Times New Roman"/>
+          <w:color w:val="000000" w:themeColor="text1"/>
+        </w:rPr>
+        <w:instrText xml:space="preserve"> SEQ Table \* ARABIC </w:instrText>
+      </w:r>
+      <w:r>
+        <w:rPr>
+          <w:rFonts w:ascii="Times New Roman" w:hAnsi="Times New Roman" w:cs="Times New Roman"/>
+          <w:color w:val="000000" w:themeColor="text1"/>
+        </w:rPr>
+        <w:fldChar w:fldCharType="separate"/>
+      </w:r>
+      <w:r>
+        <w:rPr>
+          <w:rFonts w:ascii="Times New Roman" w:hAnsi="Times New Roman" w:cs="Times New Roman"/>
+          <w:noProof/>
+          <w:color w:val="000000" w:themeColor="text1"/>
+        </w:rPr>
+        <w:t>1</w:t>
+      </w:r>
+      <w:r>
+        <w:rPr>
+          <w:rFonts w:ascii="Times New Roman" w:hAnsi="Times New Roman" w:cs="Times New Roman"/>
+          <w:color w:val="000000" w:themeColor="text1"/>
+        </w:rPr>
+        <w:fldChar w:fldCharType="end"/>
+      </w:r>
+      <w:r>
+        <w:rPr>
+          <w:rFonts w:ascii="Times New Roman" w:hAnsi="Times New Roman" w:cs="Times New Roman"/>
+          <w:color w:val="000000" w:themeColor="text1"/>
+        </w:rPr>
+        <w:t>: Irrigation Benefits (Rosenberg, 2026)</w:t>
+      </w:r>
+    </w:p>
+    <w:tbl>
+      <w:tblPr>
+        <w:tblStyle w:val="TableGrid"/>
+        <w:tblW w:w="0" w:type="auto"/>
+        <w:jc w:val="center"/>
+        <w:tblLook w:val="04A0" w:firstRow="1" w:lastRow="0" w:firstColumn="1" w:lastColumn="0" w:noHBand="0" w:noVBand="1"/>
+      </w:tblPr>
+      <w:tblGrid>
+        <w:gridCol w:w="1030"/>
+        <w:gridCol w:w="3375"/>
+      </w:tblGrid>
+      <w:tr>
+        <w:trPr>
+          <w:jc w:val="center"/>
+        </w:trPr>
+        <w:tc>
+          <w:tcPr>
+            <w:tcW w:w="1030" w:type="dxa"/>
+            <w:shd w:val="clear" w:color="auto" w:fill="7F7F7F" w:themeFill="text1" w:themeFillTint="80"/>
+          </w:tcPr>
+          <w:p>
+            <w:pPr>
+              <w:jc w:val="center"/>
+              <w:rPr>
+                <w:rFonts w:ascii="Times New Roman" w:hAnsi="Times New Roman" w:cs="Times New Roman"/>
+              </w:rPr>
+            </w:pPr>
+            <w:r>
+              <w:rPr>
+                <w:rFonts w:ascii="Times New Roman" w:hAnsi="Times New Roman" w:cs="Times New Roman"/>
+              </w:rPr>
+              <w:t>Mo</w:t>
+            </w:r>
+            <w:r>
+              <w:rPr>
+                <w:rFonts w:ascii="Times New Roman" w:hAnsi="Times New Roman" w:cs="Times New Roman"/>
+              </w:rPr>
+              <w:t>n</w:t>
+            </w:r>
+            <w:r>
+              <w:rPr>
+                <w:rFonts w:ascii="Times New Roman" w:hAnsi="Times New Roman" w:cs="Times New Roman"/>
+              </w:rPr>
+              <w:t>th</w:t>
+            </w:r>
+          </w:p>
+        </w:tc>
+        <w:tc>
+          <w:tcPr>
+            <w:tcW w:w="3375" w:type="dxa"/>
+            <w:shd w:val="clear" w:color="auto" w:fill="7F7F7F" w:themeFill="text1" w:themeFillTint="80"/>
+          </w:tcPr>
+          <w:p>
+            <w:pPr>
+              <w:jc w:val="center"/>
+              <w:rPr>
+                <w:rFonts w:ascii="Times New Roman" w:hAnsi="Times New Roman" w:cs="Times New Roman"/>
+              </w:rPr>
+            </w:pPr>
+            <w:r>
+              <w:rPr>
+                <w:rFonts w:ascii="Times New Roman" w:hAnsi="Times New Roman" w:cs="Times New Roman"/>
+              </w:rPr>
+              <w:t>Irrigation Benefits</w:t>
+            </w:r>
+            <w:r>
+              <w:rPr>
+                <w:rFonts w:ascii="Times New Roman" w:hAnsi="Times New Roman" w:cs="Times New Roman"/>
+              </w:rPr>
+              <w:t xml:space="preserve"> ($/acre-foot)</w:t>
+            </w:r>
+          </w:p>
+        </w:tc>
+      </w:tr>
+      <w:tr>
+        <w:trPr>
+          <w:jc w:val="center"/>
+        </w:trPr>
+        <w:tc>
+          <w:tcPr>
+            <w:tcW w:w="1030" w:type="dxa"/>
+          </w:tcPr>
+          <w:p>
+            <w:pPr>
+              <w:jc w:val="center"/>
+              <w:rPr>
+                <w:rFonts w:ascii="Times New Roman" w:hAnsi="Times New Roman" w:cs="Times New Roman"/>
+              </w:rPr>
+            </w:pPr>
+            <w:r>
+              <w:rPr>
+                <w:rFonts w:ascii="Times New Roman" w:hAnsi="Times New Roman" w:cs="Times New Roman"/>
+              </w:rPr>
+              <w:t>June</w:t>
+            </w:r>
+          </w:p>
+        </w:tc>
+        <w:tc>
+          <w:tcPr>
+            <w:tcW w:w="3375" w:type="dxa"/>
+          </w:tcPr>
+          <w:p>
+            <w:pPr>
+              <w:jc w:val="center"/>
+              <w:rPr>
+                <w:rFonts w:ascii="Times New Roman" w:hAnsi="Times New Roman" w:cs="Times New Roman"/>
+              </w:rPr>
+            </w:pPr>
+            <w:r>
+              <w:rPr>
+                <w:rFonts w:ascii="Times New Roman" w:hAnsi="Times New Roman" w:cs="Times New Roman"/>
+              </w:rPr>
+              <w:t>150</w:t>
+            </w:r>
+          </w:p>
+        </w:tc>
+      </w:tr>
+      <w:tr>
+        <w:trPr>
+          <w:jc w:val="center"/>
+        </w:trPr>
+        <w:tc>
+          <w:tcPr>
+            <w:tcW w:w="1030" w:type="dxa"/>
+          </w:tcPr>
+          <w:p>
+            <w:pPr>
+              <w:jc w:val="center"/>
+              <w:rPr>
+                <w:rFonts w:ascii="Times New Roman" w:hAnsi="Times New Roman" w:cs="Times New Roman"/>
+              </w:rPr>
+            </w:pPr>
+            <w:r>
+              <w:rPr>
+                <w:rFonts w:ascii="Times New Roman" w:hAnsi="Times New Roman" w:cs="Times New Roman"/>
+              </w:rPr>
+              <w:t>July</w:t>
+            </w:r>
+          </w:p>
+        </w:tc>
+        <w:tc>
+          <w:tcPr>
+            <w:tcW w:w="3375" w:type="dxa"/>
+          </w:tcPr>
+          <w:p>
+            <w:pPr>
+              <w:jc w:val="center"/>
+              <w:rPr>
+                <w:rFonts w:ascii="Times New Roman" w:hAnsi="Times New Roman" w:cs="Times New Roman"/>
+              </w:rPr>
+            </w:pPr>
+            <w:r>
+              <w:rPr>
+                <w:rFonts w:ascii="Times New Roman" w:hAnsi="Times New Roman" w:cs="Times New Roman"/>
+              </w:rPr>
+              <w:t>170</w:t>
+            </w:r>
+          </w:p>
+        </w:tc>
+      </w:tr>
+      <w:tr>
+        <w:trPr>
+          <w:jc w:val="center"/>
+        </w:trPr>
+        <w:tc>
+          <w:tcPr>
+            <w:tcW w:w="1030" w:type="dxa"/>
+          </w:tcPr>
+          <w:p>
+            <w:pPr>
+              <w:jc w:val="center"/>
+              <w:rPr>
+                <w:rFonts w:ascii="Times New Roman" w:hAnsi="Times New Roman" w:cs="Times New Roman"/>
+              </w:rPr>
+            </w:pPr>
+            <w:r>
+              <w:rPr>
+                <w:rFonts w:ascii="Times New Roman" w:hAnsi="Times New Roman" w:cs="Times New Roman"/>
+              </w:rPr>
+              <w:t>August</w:t>
+            </w:r>
+          </w:p>
+        </w:tc>
+        <w:tc>
+          <w:tcPr>
+            <w:tcW w:w="3375" w:type="dxa"/>
+          </w:tcPr>
+          <w:p>
+            <w:pPr>
+              <w:jc w:val="center"/>
+              <w:rPr>
+                <w:rFonts w:ascii="Times New Roman" w:hAnsi="Times New Roman" w:cs="Times New Roman"/>
+              </w:rPr>
+            </w:pPr>
+            <w:r>
+              <w:rPr>
+                <w:rFonts w:ascii="Times New Roman" w:hAnsi="Times New Roman" w:cs="Times New Roman"/>
+              </w:rPr>
+              <w:t>425</w:t>
+            </w:r>
+          </w:p>
+        </w:tc>
+      </w:tr>
+    </w:tbl>
     <w:p>
       <w:pPr>
         <w:spacing w:after="0"/>
         <w:rPr>
           <w:rFonts w:ascii="Times New Roman" w:hAnsi="Times New Roman" w:cs="Times New Roman"/>
-        </w:rPr>
-      </w:pPr>
-      <w:r>
-        <w:rPr>
-          <w:rFonts w:ascii="Times New Roman" w:hAnsi="Times New Roman" w:cs="Times New Roman"/>
-        </w:rPr>
-        <w:t>about the problem, and concerns the company manager will have about the</w:t>
-      </w:r>
-    </w:p>
+          <w:b/>
+          <w:bCs/>
+        </w:rPr>
+      </w:pPr>
+    </w:p>
+    <w:p>
+      <w:pPr>
+        <w:pStyle w:val="Caption"/>
+        <w:keepNext/>
+        <w:jc w:val="center"/>
+        <w:rPr>
+          <w:rFonts w:ascii="Times New Roman" w:hAnsi="Times New Roman" w:cs="Times New Roman"/>
+          <w:color w:val="000000" w:themeColor="text1"/>
+        </w:rPr>
+      </w:pPr>
+      <w:r>
+        <w:rPr>
+          <w:rFonts w:ascii="Times New Roman" w:hAnsi="Times New Roman" w:cs="Times New Roman"/>
+          <w:color w:val="000000" w:themeColor="text1"/>
+        </w:rPr>
+        <w:t xml:space="preserve">Table </w:t>
+      </w:r>
+      <w:r>
+        <w:rPr>
+          <w:rFonts w:ascii="Times New Roman" w:hAnsi="Times New Roman" w:cs="Times New Roman"/>
+          <w:color w:val="000000" w:themeColor="text1"/>
+        </w:rPr>
+        <w:fldChar w:fldCharType="begin"/>
+      </w:r>
+      <w:r>
+        <w:rPr>
+          <w:rFonts w:ascii="Times New Roman" w:hAnsi="Times New Roman" w:cs="Times New Roman"/>
+          <w:color w:val="000000" w:themeColor="text1"/>
+        </w:rPr>
+        <w:instrText xml:space="preserve"> SEQ Table \* ARABIC </w:instrText>
+      </w:r>
+      <w:r>
+        <w:rPr>
+          <w:rFonts w:ascii="Times New Roman" w:hAnsi="Times New Roman" w:cs="Times New Roman"/>
+          <w:color w:val="000000" w:themeColor="text1"/>
+        </w:rPr>
+        <w:fldChar w:fldCharType="separate"/>
+      </w:r>
+      <w:r>
+        <w:rPr>
+          <w:rFonts w:ascii="Times New Roman" w:hAnsi="Times New Roman" w:cs="Times New Roman"/>
+          <w:noProof/>
+          <w:color w:val="000000" w:themeColor="text1"/>
+        </w:rPr>
+        <w:t>2</w:t>
+      </w:r>
+      <w:r>
+        <w:rPr>
+          <w:rFonts w:ascii="Times New Roman" w:hAnsi="Times New Roman" w:cs="Times New Roman"/>
+          <w:color w:val="000000" w:themeColor="text1"/>
+        </w:rPr>
+        <w:fldChar w:fldCharType="end"/>
+      </w:r>
+      <w:r>
+        <w:rPr>
+          <w:rFonts w:ascii="Times New Roman" w:hAnsi="Times New Roman" w:cs="Times New Roman"/>
+          <w:color w:val="000000" w:themeColor="text1"/>
+        </w:rPr>
+        <w:t>: Inflows (Rosenberg, 2026)</w:t>
+      </w:r>
+    </w:p>
+    <w:tbl>
+      <w:tblPr>
+        <w:tblStyle w:val="TableGrid"/>
+        <w:tblW w:w="0" w:type="auto"/>
+        <w:jc w:val="center"/>
+        <w:tblLook w:val="04A0" w:firstRow="1" w:lastRow="0" w:firstColumn="1" w:lastColumn="0" w:noHBand="0" w:noVBand="1"/>
+      </w:tblPr>
+      <w:tblGrid>
+        <w:gridCol w:w="1030"/>
+        <w:gridCol w:w="2129"/>
+      </w:tblGrid>
+      <w:tr>
+        <w:trPr>
+          <w:jc w:val="center"/>
+        </w:trPr>
+        <w:tc>
+          <w:tcPr>
+            <w:tcW w:w="1030" w:type="dxa"/>
+            <w:shd w:val="clear" w:color="auto" w:fill="7F7F7F" w:themeFill="text1" w:themeFillTint="80"/>
+          </w:tcPr>
+          <w:p>
+            <w:pPr>
+              <w:jc w:val="center"/>
+              <w:rPr>
+                <w:rFonts w:ascii="Times New Roman" w:hAnsi="Times New Roman" w:cs="Times New Roman"/>
+              </w:rPr>
+            </w:pPr>
+            <w:r>
+              <w:rPr>
+                <w:rFonts w:ascii="Times New Roman" w:hAnsi="Times New Roman" w:cs="Times New Roman"/>
+              </w:rPr>
+              <w:t>Month</w:t>
+            </w:r>
+          </w:p>
+        </w:tc>
+        <w:tc>
+          <w:tcPr>
+            <w:tcW w:w="2129" w:type="dxa"/>
+            <w:shd w:val="clear" w:color="auto" w:fill="7F7F7F" w:themeFill="text1" w:themeFillTint="80"/>
+          </w:tcPr>
+          <w:p>
+            <w:pPr>
+              <w:jc w:val="center"/>
+              <w:rPr>
+                <w:rFonts w:ascii="Times New Roman" w:hAnsi="Times New Roman" w:cs="Times New Roman"/>
+              </w:rPr>
+            </w:pPr>
+            <w:r>
+              <w:rPr>
+                <w:rFonts w:ascii="Times New Roman" w:hAnsi="Times New Roman" w:cs="Times New Roman"/>
+              </w:rPr>
+              <w:t>Inflows (acre-feet)</w:t>
+            </w:r>
+          </w:p>
+        </w:tc>
+      </w:tr>
+      <w:tr>
+        <w:trPr>
+          <w:jc w:val="center"/>
+        </w:trPr>
+        <w:tc>
+          <w:tcPr>
+            <w:tcW w:w="1030" w:type="dxa"/>
+          </w:tcPr>
+          <w:p>
+            <w:pPr>
+              <w:jc w:val="center"/>
+              <w:rPr>
+                <w:rFonts w:ascii="Times New Roman" w:hAnsi="Times New Roman" w:cs="Times New Roman"/>
+              </w:rPr>
+            </w:pPr>
+            <w:r>
+              <w:rPr>
+                <w:rFonts w:ascii="Times New Roman" w:hAnsi="Times New Roman" w:cs="Times New Roman"/>
+              </w:rPr>
+              <w:t>June</w:t>
+            </w:r>
+          </w:p>
+        </w:tc>
+        <w:tc>
+          <w:tcPr>
+            <w:tcW w:w="2129" w:type="dxa"/>
+          </w:tcPr>
+          <w:p>
+            <w:pPr>
+              <w:jc w:val="center"/>
+              <w:rPr>
+                <w:rFonts w:ascii="Times New Roman" w:hAnsi="Times New Roman" w:cs="Times New Roman"/>
+              </w:rPr>
+            </w:pPr>
+            <w:r>
+              <w:rPr>
+                <w:rFonts w:ascii="Times New Roman" w:hAnsi="Times New Roman" w:cs="Times New Roman"/>
+              </w:rPr>
+              <w:t>5,000</w:t>
+            </w:r>
+          </w:p>
+        </w:tc>
+      </w:tr>
+      <w:tr>
+        <w:trPr>
+          <w:jc w:val="center"/>
+        </w:trPr>
+        <w:tc>
+          <w:tcPr>
+            <w:tcW w:w="1030" w:type="dxa"/>
+          </w:tcPr>
+          <w:p>
+            <w:pPr>
+              <w:jc w:val="center"/>
+              <w:rPr>
+                <w:rFonts w:ascii="Times New Roman" w:hAnsi="Times New Roman" w:cs="Times New Roman"/>
+              </w:rPr>
+            </w:pPr>
+            <w:r>
+              <w:rPr>
+                <w:rFonts w:ascii="Times New Roman" w:hAnsi="Times New Roman" w:cs="Times New Roman"/>
+              </w:rPr>
+              <w:t>July</w:t>
+            </w:r>
+          </w:p>
+        </w:tc>
+        <w:tc>
+          <w:tcPr>
+            <w:tcW w:w="2129" w:type="dxa"/>
+          </w:tcPr>
+          <w:p>
+            <w:pPr>
+              <w:jc w:val="center"/>
+              <w:rPr>
+                <w:rFonts w:ascii="Times New Roman" w:hAnsi="Times New Roman" w:cs="Times New Roman"/>
+              </w:rPr>
+            </w:pPr>
+            <w:r>
+              <w:rPr>
+                <w:rFonts w:ascii="Times New Roman" w:hAnsi="Times New Roman" w:cs="Times New Roman"/>
+              </w:rPr>
+              <w:t>3,200</w:t>
+            </w:r>
+          </w:p>
+        </w:tc>
+      </w:tr>
+      <w:tr>
+        <w:trPr>
+          <w:jc w:val="center"/>
+        </w:trPr>
+        <w:tc>
+          <w:tcPr>
+            <w:tcW w:w="1030" w:type="dxa"/>
+          </w:tcPr>
+          <w:p>
+            <w:pPr>
+              <w:jc w:val="center"/>
+              <w:rPr>
+                <w:rFonts w:ascii="Times New Roman" w:hAnsi="Times New Roman" w:cs="Times New Roman"/>
+              </w:rPr>
+            </w:pPr>
+            <w:r>
+              <w:rPr>
+                <w:rFonts w:ascii="Times New Roman" w:hAnsi="Times New Roman" w:cs="Times New Roman"/>
+              </w:rPr>
+              <w:t>August</w:t>
+            </w:r>
+          </w:p>
+        </w:tc>
+        <w:tc>
+          <w:tcPr>
+            <w:tcW w:w="2129" w:type="dxa"/>
+          </w:tcPr>
+          <w:p>
+            <w:pPr>
+              <w:jc w:val="center"/>
+              <w:rPr>
+                <w:rFonts w:ascii="Times New Roman" w:hAnsi="Times New Roman" w:cs="Times New Roman"/>
+              </w:rPr>
+            </w:pPr>
+            <w:r>
+              <w:rPr>
+                <w:rFonts w:ascii="Times New Roman" w:hAnsi="Times New Roman" w:cs="Times New Roman"/>
+              </w:rPr>
+              <w:t>2,000</w:t>
+            </w:r>
+          </w:p>
+        </w:tc>
+      </w:tr>
+    </w:tbl>
     <w:p>
       <w:pPr>
         <w:spacing w:after="0"/>
         <w:rPr>
           <w:rFonts w:ascii="Times New Roman" w:hAnsi="Times New Roman" w:cs="Times New Roman"/>
-        </w:rPr>
-      </w:pPr>
-      <w:r>
-        <w:rPr>
-          <w:rFonts w:ascii="Times New Roman" w:hAnsi="Times New Roman" w:cs="Times New Roman"/>
-        </w:rPr>
-        <w:t>model formulation and solution [10 points]</w:t>
-      </w:r>
-    </w:p>
+          <w:b/>
+          <w:bCs/>
+        </w:rPr>
+      </w:pPr>
+    </w:p>
+    <w:p>
+      <w:pPr>
+        <w:pStyle w:val="Caption"/>
+        <w:keepNext/>
+        <w:jc w:val="center"/>
+        <w:rPr>
+          <w:rFonts w:ascii="Times New Roman" w:hAnsi="Times New Roman" w:cs="Times New Roman"/>
+          <w:color w:val="000000" w:themeColor="text1"/>
+        </w:rPr>
+      </w:pPr>
+      <w:r>
+        <w:rPr>
+          <w:rFonts w:ascii="Times New Roman" w:hAnsi="Times New Roman" w:cs="Times New Roman"/>
+          <w:color w:val="000000" w:themeColor="text1"/>
+        </w:rPr>
+        <w:t xml:space="preserve">Table </w:t>
+      </w:r>
+      <w:r>
+        <w:rPr>
+          <w:rFonts w:ascii="Times New Roman" w:hAnsi="Times New Roman" w:cs="Times New Roman"/>
+          <w:color w:val="000000" w:themeColor="text1"/>
+        </w:rPr>
+        <w:fldChar w:fldCharType="begin"/>
+      </w:r>
+      <w:r>
+        <w:rPr>
+          <w:rFonts w:ascii="Times New Roman" w:hAnsi="Times New Roman" w:cs="Times New Roman"/>
+          <w:color w:val="000000" w:themeColor="text1"/>
+        </w:rPr>
+        <w:instrText xml:space="preserve"> SEQ Table \* ARABIC </w:instrText>
+      </w:r>
+      <w:r>
+        <w:rPr>
+          <w:rFonts w:ascii="Times New Roman" w:hAnsi="Times New Roman" w:cs="Times New Roman"/>
+          <w:color w:val="000000" w:themeColor="text1"/>
+        </w:rPr>
+        <w:fldChar w:fldCharType="separate"/>
+      </w:r>
+      <w:r>
+        <w:rPr>
+          <w:rFonts w:ascii="Times New Roman" w:hAnsi="Times New Roman" w:cs="Times New Roman"/>
+          <w:color w:val="000000" w:themeColor="text1"/>
+        </w:rPr>
+        <w:t>3</w:t>
+      </w:r>
+      <w:r>
+        <w:rPr>
+          <w:rFonts w:ascii="Times New Roman" w:hAnsi="Times New Roman" w:cs="Times New Roman"/>
+          <w:color w:val="000000" w:themeColor="text1"/>
+        </w:rPr>
+        <w:fldChar w:fldCharType="end"/>
+      </w:r>
+      <w:r>
+        <w:rPr>
+          <w:rFonts w:ascii="Times New Roman" w:hAnsi="Times New Roman" w:cs="Times New Roman"/>
+          <w:color w:val="000000" w:themeColor="text1"/>
+        </w:rPr>
+        <w:t>: Diversion Schedule</w:t>
+      </w:r>
+    </w:p>
+    <w:tbl>
+      <w:tblPr>
+        <w:tblStyle w:val="TableGrid"/>
+        <w:tblW w:w="0" w:type="auto"/>
+        <w:jc w:val="center"/>
+        <w:tblLook w:val="04A0" w:firstRow="1" w:lastRow="0" w:firstColumn="1" w:lastColumn="0" w:noHBand="0" w:noVBand="1"/>
+      </w:tblPr>
+      <w:tblGrid>
+        <w:gridCol w:w="1075"/>
+        <w:gridCol w:w="2250"/>
+        <w:gridCol w:w="2700"/>
+      </w:tblGrid>
+      <w:tr>
+        <w:trPr>
+          <w:jc w:val="center"/>
+        </w:trPr>
+        <w:tc>
+          <w:tcPr>
+            <w:tcW w:w="1075" w:type="dxa"/>
+            <w:shd w:val="clear" w:color="auto" w:fill="7F7F7F" w:themeFill="text1" w:themeFillTint="80"/>
+            <w:vAlign w:val="bottom"/>
+          </w:tcPr>
+          <w:p>
+            <w:pPr>
+              <w:jc w:val="center"/>
+              <w:rPr>
+                <w:rFonts w:ascii="Times New Roman" w:hAnsi="Times New Roman" w:cs="Times New Roman"/>
+              </w:rPr>
+            </w:pPr>
+            <w:r>
+              <w:rPr>
+                <w:rFonts w:ascii="Times New Roman" w:hAnsi="Times New Roman" w:cs="Times New Roman"/>
+              </w:rPr>
+              <w:t>Month</w:t>
+            </w:r>
+          </w:p>
+        </w:tc>
+        <w:tc>
+          <w:tcPr>
+            <w:tcW w:w="2250" w:type="dxa"/>
+            <w:shd w:val="clear" w:color="auto" w:fill="7F7F7F" w:themeFill="text1" w:themeFillTint="80"/>
+            <w:vAlign w:val="bottom"/>
+          </w:tcPr>
+          <w:p>
+            <w:pPr>
+              <w:jc w:val="center"/>
+              <w:rPr>
+                <w:rFonts w:ascii="Times New Roman" w:hAnsi="Times New Roman" w:cs="Times New Roman"/>
+              </w:rPr>
+            </w:pPr>
+            <w:r>
+              <w:rPr>
+                <w:rFonts w:ascii="Times New Roman" w:hAnsi="Times New Roman" w:cs="Times New Roman"/>
+              </w:rPr>
+              <w:t>Diversion Amount (acre-feet)</w:t>
+            </w:r>
+          </w:p>
+        </w:tc>
+        <w:tc>
+          <w:tcPr>
+            <w:tcW w:w="2700" w:type="dxa"/>
+            <w:shd w:val="clear" w:color="auto" w:fill="7F7F7F" w:themeFill="text1" w:themeFillTint="80"/>
+            <w:vAlign w:val="bottom"/>
+          </w:tcPr>
+          <w:p>
+            <w:pPr>
+              <w:jc w:val="center"/>
+              <w:rPr>
+                <w:rFonts w:ascii="Times New Roman" w:hAnsi="Times New Roman" w:cs="Times New Roman"/>
+              </w:rPr>
+            </w:pPr>
+            <w:r>
+              <w:rPr>
+                <w:rFonts w:ascii="Times New Roman" w:hAnsi="Times New Roman" w:cs="Times New Roman"/>
+              </w:rPr>
+              <w:t>Corresponding Reservoir Level (acre-feet)</w:t>
+            </w:r>
+          </w:p>
+        </w:tc>
+      </w:tr>
+      <w:tr>
+        <w:trPr>
+          <w:jc w:val="center"/>
+        </w:trPr>
+        <w:tc>
+          <w:tcPr>
+            <w:tcW w:w="1075" w:type="dxa"/>
+          </w:tcPr>
+          <w:p>
+            <w:pPr>
+              <w:jc w:val="center"/>
+              <w:rPr>
+                <w:rFonts w:ascii="Times New Roman" w:hAnsi="Times New Roman" w:cs="Times New Roman"/>
+              </w:rPr>
+            </w:pPr>
+            <w:r>
+              <w:rPr>
+                <w:rFonts w:ascii="Times New Roman" w:hAnsi="Times New Roman" w:cs="Times New Roman"/>
+              </w:rPr>
+              <w:t>June</w:t>
+            </w:r>
+          </w:p>
+        </w:tc>
+        <w:tc>
+          <w:tcPr>
+            <w:tcW w:w="2250" w:type="dxa"/>
+          </w:tcPr>
+          <w:p>
+            <w:pPr>
+              <w:jc w:val="center"/>
+              <w:rPr>
+                <w:rFonts w:ascii="Times New Roman" w:hAnsi="Times New Roman" w:cs="Times New Roman"/>
+              </w:rPr>
+            </w:pPr>
+            <w:r>
+              <w:rPr>
+                <w:rFonts w:ascii="Times New Roman" w:hAnsi="Times New Roman" w:cs="Times New Roman"/>
+              </w:rPr>
+              <w:t>0</w:t>
+            </w:r>
+          </w:p>
+        </w:tc>
+        <w:tc>
+          <w:tcPr>
+            <w:tcW w:w="2700" w:type="dxa"/>
+          </w:tcPr>
+          <w:p>
+            <w:pPr>
+              <w:jc w:val="center"/>
+              <w:rPr>
+                <w:rFonts w:ascii="Times New Roman" w:hAnsi="Times New Roman" w:cs="Times New Roman"/>
+              </w:rPr>
+            </w:pPr>
+            <w:r>
+              <w:rPr>
+                <w:rFonts w:ascii="Times New Roman" w:hAnsi="Times New Roman" w:cs="Times New Roman"/>
+              </w:rPr>
+              <w:t>8,000</w:t>
+            </w:r>
+          </w:p>
+        </w:tc>
+      </w:tr>
+      <w:tr>
+        <w:trPr>
+          <w:jc w:val="center"/>
+        </w:trPr>
+        <w:tc>
+          <w:tcPr>
+            <w:tcW w:w="1075" w:type="dxa"/>
+          </w:tcPr>
+          <w:p>
+            <w:pPr>
+              <w:jc w:val="center"/>
+              <w:rPr>
+                <w:rFonts w:ascii="Times New Roman" w:hAnsi="Times New Roman" w:cs="Times New Roman"/>
+              </w:rPr>
+            </w:pPr>
+            <w:r>
+              <w:rPr>
+                <w:rFonts w:ascii="Times New Roman" w:hAnsi="Times New Roman" w:cs="Times New Roman"/>
+              </w:rPr>
+              <w:t>July</w:t>
+            </w:r>
+          </w:p>
+        </w:tc>
+        <w:tc>
+          <w:tcPr>
+            <w:tcW w:w="2250" w:type="dxa"/>
+          </w:tcPr>
+          <w:p>
+            <w:pPr>
+              <w:jc w:val="center"/>
+              <w:rPr>
+                <w:rFonts w:ascii="Times New Roman" w:hAnsi="Times New Roman" w:cs="Times New Roman"/>
+              </w:rPr>
+            </w:pPr>
+            <w:r>
+              <w:rPr>
+                <w:rFonts w:ascii="Times New Roman" w:hAnsi="Times New Roman" w:cs="Times New Roman"/>
+              </w:rPr>
+              <w:t>2,200</w:t>
+            </w:r>
+          </w:p>
+        </w:tc>
+        <w:tc>
+          <w:tcPr>
+            <w:tcW w:w="2700" w:type="dxa"/>
+          </w:tcPr>
+          <w:p>
+            <w:pPr>
+              <w:jc w:val="center"/>
+              <w:rPr>
+                <w:rFonts w:ascii="Times New Roman" w:hAnsi="Times New Roman" w:cs="Times New Roman"/>
+              </w:rPr>
+            </w:pPr>
+            <w:r>
+              <w:rPr>
+                <w:rFonts w:ascii="Times New Roman" w:hAnsi="Times New Roman" w:cs="Times New Roman"/>
+              </w:rPr>
+              <w:t>9,000</w:t>
+            </w:r>
+          </w:p>
+        </w:tc>
+      </w:tr>
+      <w:tr>
+        <w:trPr>
+          <w:jc w:val="center"/>
+        </w:trPr>
+        <w:tc>
+          <w:tcPr>
+            <w:tcW w:w="1075" w:type="dxa"/>
+          </w:tcPr>
+          <w:p>
+            <w:pPr>
+              <w:jc w:val="center"/>
+              <w:rPr>
+                <w:rFonts w:ascii="Times New Roman" w:hAnsi="Times New Roman" w:cs="Times New Roman"/>
+              </w:rPr>
+            </w:pPr>
+            <w:r>
+              <w:rPr>
+                <w:rFonts w:ascii="Times New Roman" w:hAnsi="Times New Roman" w:cs="Times New Roman"/>
+              </w:rPr>
+              <w:t>August</w:t>
+            </w:r>
+          </w:p>
+        </w:tc>
+        <w:tc>
+          <w:tcPr>
+            <w:tcW w:w="2250" w:type="dxa"/>
+          </w:tcPr>
+          <w:p>
+            <w:pPr>
+              <w:jc w:val="center"/>
+              <w:rPr>
+                <w:rFonts w:ascii="Times New Roman" w:hAnsi="Times New Roman" w:cs="Times New Roman"/>
+              </w:rPr>
+            </w:pPr>
+            <w:r>
+              <w:rPr>
+                <w:rFonts w:ascii="Times New Roman" w:hAnsi="Times New Roman" w:cs="Times New Roman"/>
+              </w:rPr>
+              <w:t>8,000</w:t>
+            </w:r>
+          </w:p>
+        </w:tc>
+        <w:tc>
+          <w:tcPr>
+            <w:tcW w:w="2700" w:type="dxa"/>
+          </w:tcPr>
+          <w:p>
+            <w:pPr>
+              <w:jc w:val="center"/>
+              <w:rPr>
+                <w:rFonts w:ascii="Times New Roman" w:hAnsi="Times New Roman" w:cs="Times New Roman"/>
+              </w:rPr>
+            </w:pPr>
+            <w:r>
+              <w:rPr>
+                <w:rFonts w:ascii="Times New Roman" w:hAnsi="Times New Roman" w:cs="Times New Roman"/>
+              </w:rPr>
+              <w:t>3,000</w:t>
+            </w:r>
+          </w:p>
+        </w:tc>
+      </w:tr>
+    </w:tbl>
     <w:p>
       <w:pPr>
         <w:spacing w:after="0"/>
         <w:rPr>
           <w:rFonts w:ascii="Times New Roman" w:hAnsi="Times New Roman" w:cs="Times New Roman"/>
-        </w:rPr>
-      </w:pPr>
-      <w:r>
-        <w:rPr>
-          <w:rFonts w:ascii="Times New Roman" w:hAnsi="Times New Roman" w:cs="Times New Roman"/>
+          <w:b/>
+          <w:bCs/>
+        </w:rPr>
+      </w:pPr>
+    </w:p>
+    <w:p>
+      <w:pPr>
+        <w:rPr>
+          <w:rFonts w:ascii="Times New Roman" w:hAnsi="Times New Roman" w:cs="Times New Roman"/>
+          <w:b/>
+          <w:bCs/>
+        </w:rPr>
+      </w:pPr>
+      <w:r>
+        <w:rPr>
+          <w:rFonts w:ascii="Times New Roman" w:hAnsi="Times New Roman" w:cs="Times New Roman"/>
+          <w:b/>
+          <w:bCs/>
         </w:rPr>
         <w:br w:type="page"/>
       </w:r>
@@ -1771,14 +2710,18 @@
         <w:spacing w:after="0"/>
         <w:rPr>
           <w:rFonts w:ascii="Times New Roman" w:hAnsi="Times New Roman" w:cs="Times New Roman"/>
-        </w:rPr>
-      </w:pPr>
-      <w:r>
-        <w:rPr>
-          <w:rFonts w:ascii="Times New Roman" w:hAnsi="Times New Roman" w:cs="Times New Roman"/>
+          <w:b/>
+          <w:bCs/>
+        </w:rPr>
+      </w:pPr>
+      <w:r>
+        <w:rPr>
+          <w:rFonts w:ascii="Times New Roman" w:hAnsi="Times New Roman" w:cs="Times New Roman"/>
+          <w:b/>
+          <w:bCs/>
         </w:rPr>
         <w:lastRenderedPageBreak/>
-        <w:t>Dimensions</w:t>
+        <w:t>Appendix B - References</w:t>
       </w:r>
     </w:p>
     <w:p>
@@ -1786,20 +2729,10 @@
         <w:spacing w:after="0"/>
         <w:rPr>
           <w:rFonts w:ascii="Times New Roman" w:hAnsi="Times New Roman" w:cs="Times New Roman"/>
-        </w:rPr>
-      </w:pPr>
-      <w:r>
-        <w:rPr>
-          <w:rFonts w:ascii="Times New Roman" w:hAnsi="Times New Roman" w:cs="Times New Roman"/>
-        </w:rPr>
-        <w:t>Time (Month)</w:t>
-      </w:r>
-      <w:r>
-        <w:rPr>
-          <w:rFonts w:ascii="Times New Roman" w:hAnsi="Times New Roman" w:cs="Times New Roman"/>
-        </w:rPr>
-        <w:t xml:space="preserve"> – June, July, August</w:t>
-      </w:r>
+          <w:b/>
+          <w:bCs/>
+        </w:rPr>
+      </w:pPr>
     </w:p>
     <w:p>
       <w:pPr>
@@ -1812,7 +2745,7 @@
         <w:rPr>
           <w:rFonts w:ascii="Times New Roman" w:hAnsi="Times New Roman" w:cs="Times New Roman"/>
         </w:rPr>
-        <w:t>Spatial (Network) – Spill, Diversion, Reservoir Storage</w:t>
+        <w:t>GAMS Development Corporation. (2026). General Algebraic Modeling System (GAMS) (Release 54.4.0) [Computer software]. https://www.gams.com/</w:t>
       </w:r>
     </w:p>
     <w:p>
@@ -1834,7 +2767,7 @@
         <w:rPr>
           <w:rFonts w:ascii="Times New Roman" w:hAnsi="Times New Roman" w:cs="Times New Roman"/>
         </w:rPr>
-        <w:t xml:space="preserve">Decision Variables </w:t>
+        <w:t>Rosenberg, D. (2026). HW3-LinearPrograminGAMS. Logan; Utah State University.</w:t>
       </w:r>
     </w:p>
     <w:p>
@@ -1844,71 +2777,23 @@
           <w:rFonts w:ascii="Times New Roman" w:hAnsi="Times New Roman" w:cs="Times New Roman"/>
         </w:rPr>
       </w:pPr>
-      <w:r>
-        <w:rPr>
-          <w:rFonts w:ascii="Times New Roman" w:hAnsi="Times New Roman" w:cs="Times New Roman"/>
-        </w:rPr>
-        <w:t xml:space="preserve">How much water to release to diversion in time </w:t>
-      </w:r>
-      <w:r>
-        <w:rPr>
-          <w:rFonts w:ascii="Times New Roman" w:hAnsi="Times New Roman" w:cs="Times New Roman"/>
-        </w:rPr>
-        <w:t>(</w:t>
-      </w:r>
-      <w:r>
-        <w:rPr>
-          <w:rFonts w:ascii="Times New Roman" w:hAnsi="Times New Roman" w:cs="Times New Roman"/>
-        </w:rPr>
-        <w:t>t</w:t>
-      </w:r>
-      <w:r>
-        <w:rPr>
-          <w:rFonts w:ascii="Times New Roman" w:hAnsi="Times New Roman" w:cs="Times New Roman"/>
-        </w:rPr>
-        <w:t>)</w:t>
-      </w:r>
     </w:p>
     <w:p>
       <w:pPr>
         <w:spacing w:after="0"/>
         <w:rPr>
           <w:rFonts w:ascii="Times New Roman" w:hAnsi="Times New Roman" w:cs="Times New Roman"/>
-        </w:rPr>
-      </w:pPr>
-      <w:proofErr w:type="spellStart"/>
-      <w:proofErr w:type="gramStart"/>
-      <w:r>
-        <w:rPr>
-          <w:rFonts w:ascii="Times New Roman" w:hAnsi="Times New Roman" w:cs="Times New Roman"/>
-        </w:rPr>
-        <w:t>X</w:t>
-      </w:r>
-      <w:r>
-        <w:rPr>
-          <w:rFonts w:ascii="Times New Roman" w:hAnsi="Times New Roman" w:cs="Times New Roman"/>
-        </w:rPr>
-        <w:t>div</w:t>
-      </w:r>
-      <w:proofErr w:type="spellEnd"/>
-      <w:r>
-        <w:rPr>
-          <w:rFonts w:ascii="Times New Roman" w:hAnsi="Times New Roman" w:cs="Times New Roman"/>
-        </w:rPr>
-        <w:t xml:space="preserve"> </w:t>
-      </w:r>
-      <w:r>
-        <w:rPr>
-          <w:rFonts w:ascii="Times New Roman" w:hAnsi="Times New Roman" w:cs="Times New Roman"/>
-        </w:rPr>
-        <w:t>,</w:t>
-      </w:r>
-      <w:proofErr w:type="gramEnd"/>
-      <w:r>
-        <w:rPr>
-          <w:rFonts w:ascii="Times New Roman" w:hAnsi="Times New Roman" w:cs="Times New Roman"/>
-        </w:rPr>
-        <w:t xml:space="preserve"> t [acre-ft]</w:t>
+          <w:b/>
+          <w:bCs/>
+        </w:rPr>
+      </w:pPr>
+      <w:r>
+        <w:rPr>
+          <w:rFonts w:ascii="Times New Roman" w:hAnsi="Times New Roman" w:cs="Times New Roman"/>
+          <w:b/>
+          <w:bCs/>
+        </w:rPr>
+        <w:t>AI Statement</w:t>
       </w:r>
     </w:p>
     <w:p>
@@ -1922,1180 +2807,64 @@
         <w:rPr>
           <w:rFonts w:ascii="Times New Roman" w:hAnsi="Times New Roman" w:cs="Times New Roman"/>
         </w:rPr>
-        <w:t xml:space="preserve">How much </w:t>
-      </w:r>
-      <w:r>
-        <w:rPr>
-          <w:rFonts w:ascii="Times New Roman" w:hAnsi="Times New Roman" w:cs="Times New Roman"/>
-        </w:rPr>
-        <w:t xml:space="preserve">water </w:t>
-      </w:r>
-      <w:r>
-        <w:rPr>
-          <w:rFonts w:ascii="Times New Roman" w:hAnsi="Times New Roman" w:cs="Times New Roman"/>
-        </w:rPr>
-        <w:t>to keep in reservoir storage</w:t>
-      </w:r>
-      <w:r>
-        <w:rPr>
-          <w:rFonts w:ascii="Times New Roman" w:hAnsi="Times New Roman" w:cs="Times New Roman"/>
-        </w:rPr>
-        <w:t xml:space="preserve"> at the end of</w:t>
-      </w:r>
-      <w:r>
-        <w:rPr>
-          <w:rFonts w:ascii="Times New Roman" w:hAnsi="Times New Roman" w:cs="Times New Roman"/>
-        </w:rPr>
-        <w:t xml:space="preserve"> time (t)</w:t>
-      </w:r>
-    </w:p>
-    <w:p>
-      <w:pPr>
-        <w:spacing w:after="0"/>
-        <w:rPr>
-          <w:rFonts w:ascii="Times New Roman" w:hAnsi="Times New Roman" w:cs="Times New Roman"/>
-        </w:rPr>
-      </w:pPr>
-      <w:proofErr w:type="spellStart"/>
-      <w:proofErr w:type="gramStart"/>
-      <w:r>
-        <w:rPr>
-          <w:rFonts w:ascii="Times New Roman" w:hAnsi="Times New Roman" w:cs="Times New Roman"/>
-        </w:rPr>
-        <w:t>X</w:t>
-      </w:r>
-      <w:r>
-        <w:rPr>
-          <w:rFonts w:ascii="Times New Roman" w:hAnsi="Times New Roman" w:cs="Times New Roman"/>
-        </w:rPr>
-        <w:t>res</w:t>
-      </w:r>
-      <w:proofErr w:type="spellEnd"/>
-      <w:r>
-        <w:rPr>
-          <w:rFonts w:ascii="Times New Roman" w:hAnsi="Times New Roman" w:cs="Times New Roman"/>
-        </w:rPr>
-        <w:t xml:space="preserve"> ,</w:t>
-      </w:r>
-      <w:proofErr w:type="gramEnd"/>
-      <w:r>
-        <w:rPr>
-          <w:rFonts w:ascii="Times New Roman" w:hAnsi="Times New Roman" w:cs="Times New Roman"/>
-        </w:rPr>
-        <w:t xml:space="preserve"> t [acre-ft]</w:t>
-      </w:r>
-    </w:p>
-    <w:p>
-      <w:pPr>
-        <w:spacing w:after="0"/>
-        <w:rPr>
-          <w:rFonts w:ascii="Times New Roman" w:hAnsi="Times New Roman" w:cs="Times New Roman"/>
-        </w:rPr>
-      </w:pPr>
-      <w:r>
-        <w:rPr>
-          <w:rFonts w:ascii="Times New Roman" w:hAnsi="Times New Roman" w:cs="Times New Roman"/>
-        </w:rPr>
-        <w:t xml:space="preserve">How much water to spill </w:t>
-      </w:r>
-      <w:r>
-        <w:rPr>
-          <w:rFonts w:ascii="Times New Roman" w:hAnsi="Times New Roman" w:cs="Times New Roman"/>
-        </w:rPr>
-        <w:t>in time (t)</w:t>
-      </w:r>
-    </w:p>
-    <w:p>
-      <w:pPr>
-        <w:spacing w:after="0"/>
-        <w:rPr>
-          <w:rFonts w:ascii="Times New Roman" w:hAnsi="Times New Roman" w:cs="Times New Roman"/>
-        </w:rPr>
-      </w:pPr>
-      <w:proofErr w:type="spellStart"/>
-      <w:proofErr w:type="gramStart"/>
-      <w:r>
-        <w:rPr>
-          <w:rFonts w:ascii="Times New Roman" w:hAnsi="Times New Roman" w:cs="Times New Roman"/>
-        </w:rPr>
-        <w:t>X</w:t>
-      </w:r>
-      <w:r>
-        <w:rPr>
-          <w:rFonts w:ascii="Times New Roman" w:hAnsi="Times New Roman" w:cs="Times New Roman"/>
-        </w:rPr>
-        <w:t>spill</w:t>
-      </w:r>
-      <w:proofErr w:type="spellEnd"/>
-      <w:r>
-        <w:rPr>
-          <w:rFonts w:ascii="Times New Roman" w:hAnsi="Times New Roman" w:cs="Times New Roman"/>
-        </w:rPr>
-        <w:t xml:space="preserve"> ,</w:t>
-      </w:r>
-      <w:proofErr w:type="gramEnd"/>
-      <w:r>
-        <w:rPr>
-          <w:rFonts w:ascii="Times New Roman" w:hAnsi="Times New Roman" w:cs="Times New Roman"/>
-        </w:rPr>
-        <w:t xml:space="preserve"> t [acre-ft]</w:t>
-      </w:r>
-    </w:p>
-    <w:p>
-      <w:pPr>
-        <w:spacing w:after="0"/>
-        <w:rPr>
-          <w:rFonts w:ascii="Times New Roman" w:hAnsi="Times New Roman" w:cs="Times New Roman"/>
-        </w:rPr>
-      </w:pPr>
-      <w:r>
-        <w:rPr>
-          <w:rFonts w:ascii="Times New Roman" w:hAnsi="Times New Roman" w:cs="Times New Roman"/>
-        </w:rPr>
-        <w:t xml:space="preserve">Objective Function </w:t>
-      </w:r>
-    </w:p>
-    <w:p>
-      <w:pPr>
-        <w:spacing w:after="0"/>
-        <w:rPr>
-          <w:rFonts w:ascii="Times New Roman" w:hAnsi="Times New Roman" w:cs="Times New Roman"/>
-        </w:rPr>
-      </w:pPr>
-      <w:r>
-        <w:rPr>
-          <w:rFonts w:ascii="Times New Roman" w:hAnsi="Times New Roman" w:cs="Times New Roman"/>
-        </w:rPr>
-        <w:t>Maximize the Irrigation Benefits ($)</w:t>
-      </w:r>
-    </w:p>
-    <w:p>
-      <w:pPr>
-        <w:spacing w:after="0"/>
-        <w:rPr>
-          <w:rFonts w:ascii="Times New Roman" w:hAnsi="Times New Roman" w:cs="Times New Roman"/>
-        </w:rPr>
-      </w:pPr>
-      <w:r>
-        <w:rPr>
-          <w:rFonts w:ascii="Times New Roman" w:hAnsi="Times New Roman" w:cs="Times New Roman"/>
-        </w:rPr>
-        <w:t>Max Z = 150</w:t>
-      </w:r>
-      <w:proofErr w:type="gramStart"/>
-      <w:r>
-        <w:rPr>
-          <w:rFonts w:ascii="Times New Roman" w:hAnsi="Times New Roman" w:cs="Times New Roman"/>
-        </w:rPr>
-        <w:t>X</w:t>
-      </w:r>
-      <w:r>
-        <w:rPr>
-          <w:rFonts w:ascii="Times New Roman" w:hAnsi="Times New Roman" w:cs="Times New Roman"/>
-        </w:rPr>
-        <w:t>div</w:t>
-      </w:r>
-      <w:r>
-        <w:rPr>
-          <w:rFonts w:ascii="Times New Roman" w:hAnsi="Times New Roman" w:cs="Times New Roman"/>
-        </w:rPr>
-        <w:t>,june</w:t>
-      </w:r>
-      <w:proofErr w:type="gramEnd"/>
-      <w:r>
-        <w:rPr>
-          <w:rFonts w:ascii="Times New Roman" w:hAnsi="Times New Roman" w:cs="Times New Roman"/>
-        </w:rPr>
-        <w:t xml:space="preserve"> + 170</w:t>
-      </w:r>
-      <w:proofErr w:type="gramStart"/>
-      <w:r>
-        <w:rPr>
-          <w:rFonts w:ascii="Times New Roman" w:hAnsi="Times New Roman" w:cs="Times New Roman"/>
-        </w:rPr>
-        <w:t>X</w:t>
-      </w:r>
-      <w:r>
-        <w:rPr>
-          <w:rFonts w:ascii="Times New Roman" w:hAnsi="Times New Roman" w:cs="Times New Roman"/>
-        </w:rPr>
-        <w:t>div,</w:t>
-      </w:r>
-      <w:r>
-        <w:rPr>
-          <w:rFonts w:ascii="Times New Roman" w:hAnsi="Times New Roman" w:cs="Times New Roman"/>
-        </w:rPr>
-        <w:t>July</w:t>
-      </w:r>
-      <w:proofErr w:type="gramEnd"/>
-      <w:r>
-        <w:rPr>
-          <w:rFonts w:ascii="Times New Roman" w:hAnsi="Times New Roman" w:cs="Times New Roman"/>
-        </w:rPr>
-        <w:t xml:space="preserve"> </w:t>
-      </w:r>
-      <w:r>
-        <w:rPr>
-          <w:rFonts w:ascii="Times New Roman" w:hAnsi="Times New Roman" w:cs="Times New Roman"/>
-        </w:rPr>
-        <w:t>+ 425</w:t>
-      </w:r>
-      <w:proofErr w:type="gramStart"/>
-      <w:r>
-        <w:rPr>
-          <w:rFonts w:ascii="Times New Roman" w:hAnsi="Times New Roman" w:cs="Times New Roman"/>
-        </w:rPr>
-        <w:t>X</w:t>
-      </w:r>
-      <w:r>
-        <w:rPr>
-          <w:rFonts w:ascii="Times New Roman" w:hAnsi="Times New Roman" w:cs="Times New Roman"/>
-        </w:rPr>
-        <w:t>div,august</w:t>
-      </w:r>
-      <w:proofErr w:type="gramEnd"/>
-      <w:r>
-        <w:rPr>
-          <w:rFonts w:ascii="Times New Roman" w:hAnsi="Times New Roman" w:cs="Times New Roman"/>
-        </w:rPr>
-        <w:t xml:space="preserve"> </w:t>
-      </w:r>
-    </w:p>
-    <w:p>
-      <w:pPr>
-        <w:spacing w:after="0"/>
-        <w:rPr>
-          <w:rFonts w:ascii="Times New Roman" w:hAnsi="Times New Roman" w:cs="Times New Roman"/>
-        </w:rPr>
-      </w:pPr>
-      <w:r>
-        <w:rPr>
-          <w:rFonts w:ascii="Times New Roman" w:hAnsi="Times New Roman" w:cs="Times New Roman"/>
-        </w:rPr>
-        <w:t xml:space="preserve">= </w:t>
-      </w:r>
-      <w:proofErr w:type="gramStart"/>
-      <w:r>
-        <w:rPr>
-          <w:rFonts w:ascii="Times New Roman" w:hAnsi="Times New Roman" w:cs="Times New Roman"/>
-        </w:rPr>
-        <w:t>SUM(</w:t>
-      </w:r>
-      <w:proofErr w:type="spellStart"/>
-      <w:proofErr w:type="gramEnd"/>
-      <w:r>
-        <w:rPr>
-          <w:rFonts w:ascii="Times New Roman" w:hAnsi="Times New Roman" w:cs="Times New Roman"/>
-        </w:rPr>
-        <w:t>c</w:t>
-      </w:r>
-      <w:r>
-        <w:rPr>
-          <w:rFonts w:ascii="Times New Roman" w:hAnsi="Times New Roman" w:cs="Times New Roman"/>
-        </w:rPr>
-        <w:t>t</w:t>
-      </w:r>
-      <w:proofErr w:type="spellEnd"/>
-      <w:r>
-        <w:rPr>
-          <w:rFonts w:ascii="Times New Roman" w:hAnsi="Times New Roman" w:cs="Times New Roman"/>
-        </w:rPr>
-        <w:t>*</w:t>
-      </w:r>
-      <w:proofErr w:type="spellStart"/>
-      <w:proofErr w:type="gramStart"/>
-      <w:r>
-        <w:rPr>
-          <w:rFonts w:ascii="Times New Roman" w:hAnsi="Times New Roman" w:cs="Times New Roman"/>
-        </w:rPr>
-        <w:t>X</w:t>
-      </w:r>
-      <w:r>
-        <w:rPr>
-          <w:rFonts w:ascii="Times New Roman" w:hAnsi="Times New Roman" w:cs="Times New Roman"/>
-        </w:rPr>
-        <w:t>div,t</w:t>
-      </w:r>
-      <w:proofErr w:type="spellEnd"/>
-      <w:proofErr w:type="gramEnd"/>
-      <w:r>
-        <w:rPr>
-          <w:rFonts w:ascii="Times New Roman" w:hAnsi="Times New Roman" w:cs="Times New Roman"/>
-        </w:rPr>
-        <w:t>) + SUM(0*</w:t>
-      </w:r>
-      <w:proofErr w:type="spellStart"/>
-      <w:proofErr w:type="gramStart"/>
-      <w:r>
-        <w:rPr>
-          <w:rFonts w:ascii="Times New Roman" w:hAnsi="Times New Roman" w:cs="Times New Roman"/>
-        </w:rPr>
-        <w:t>X</w:t>
-      </w:r>
-      <w:r>
-        <w:rPr>
-          <w:rFonts w:ascii="Times New Roman" w:hAnsi="Times New Roman" w:cs="Times New Roman"/>
-        </w:rPr>
-        <w:t>spill,t</w:t>
-      </w:r>
-      <w:proofErr w:type="spellEnd"/>
-      <w:proofErr w:type="gramEnd"/>
-      <w:r>
-        <w:rPr>
-          <w:rFonts w:ascii="Times New Roman" w:hAnsi="Times New Roman" w:cs="Times New Roman"/>
-        </w:rPr>
-        <w:t>) + SUM(</w:t>
-      </w:r>
-      <w:r>
-        <w:rPr>
-          <w:rFonts w:ascii="Times New Roman" w:hAnsi="Times New Roman" w:cs="Times New Roman"/>
-        </w:rPr>
-        <w:t>0*</w:t>
-      </w:r>
-      <w:proofErr w:type="spellStart"/>
-      <w:proofErr w:type="gramStart"/>
-      <w:r>
-        <w:rPr>
-          <w:rFonts w:ascii="Times New Roman" w:hAnsi="Times New Roman" w:cs="Times New Roman"/>
-        </w:rPr>
-        <w:t>X</w:t>
-      </w:r>
-      <w:r>
-        <w:rPr>
-          <w:rFonts w:ascii="Times New Roman" w:hAnsi="Times New Roman" w:cs="Times New Roman"/>
-        </w:rPr>
-        <w:t>res,t</w:t>
-      </w:r>
-      <w:proofErr w:type="spellEnd"/>
-      <w:proofErr w:type="gramEnd"/>
-      <w:r>
-        <w:rPr>
-          <w:rFonts w:ascii="Times New Roman" w:hAnsi="Times New Roman" w:cs="Times New Roman"/>
-        </w:rPr>
-        <w:t>)</w:t>
-      </w:r>
-    </w:p>
-    <w:p>
-      <w:pPr>
-        <w:spacing w:after="0"/>
-        <w:rPr>
-          <w:rFonts w:ascii="Times New Roman" w:hAnsi="Times New Roman" w:cs="Times New Roman"/>
-        </w:rPr>
-      </w:pPr>
-      <w:r>
-        <w:rPr>
-          <w:rFonts w:ascii="Times New Roman" w:hAnsi="Times New Roman" w:cs="Times New Roman"/>
-        </w:rPr>
-        <w:t>Constraints</w:t>
-      </w:r>
-    </w:p>
-    <w:p>
-      <w:pPr>
-        <w:spacing w:after="0"/>
-        <w:rPr>
-          <w:rFonts w:ascii="Times New Roman" w:hAnsi="Times New Roman" w:cs="Times New Roman"/>
-        </w:rPr>
-      </w:pPr>
-      <w:r>
-        <w:rPr>
-          <w:rFonts w:ascii="Times New Roman" w:hAnsi="Times New Roman" w:cs="Times New Roman"/>
-        </w:rPr>
-        <w:t>The reservoir has a capacity of 9,000 acre-feet</w:t>
-      </w:r>
-      <w:r>
-        <w:rPr>
-          <w:rFonts w:ascii="Times New Roman" w:hAnsi="Times New Roman" w:cs="Times New Roman"/>
-        </w:rPr>
-        <w:t xml:space="preserve"> (3 constraints)</w:t>
-      </w:r>
-    </w:p>
-    <w:p>
-      <w:pPr>
-        <w:spacing w:after="0"/>
-        <w:rPr>
-          <w:rFonts w:ascii="Times New Roman" w:hAnsi="Times New Roman" w:cs="Times New Roman"/>
-        </w:rPr>
-      </w:pPr>
-      <m:oMathPara>
-        <m:oMath>
-          <m:sSub>
-            <m:sSubPr>
-              <m:ctrlPr>
-                <w:rPr>
-                  <w:rFonts w:ascii="Cambria Math" w:hAnsi="Cambria Math" w:cs="Times New Roman"/>
-                </w:rPr>
-              </m:ctrlPr>
-            </m:sSubPr>
-            <m:e>
-              <m:r>
-                <w:rPr>
-                  <w:rFonts w:ascii="Cambria Math" w:hAnsi="Cambria Math" w:cs="Times New Roman"/>
-                </w:rPr>
-                <m:t>X</m:t>
-              </m:r>
-            </m:e>
-            <m:sub>
-              <m:r>
-                <w:rPr>
-                  <w:rFonts w:ascii="Cambria Math" w:hAnsi="Cambria Math" w:cs="Times New Roman"/>
-                </w:rPr>
-                <m:t>res</m:t>
-              </m:r>
-              <m:r>
-                <m:rPr>
-                  <m:sty m:val="p"/>
-                </m:rPr>
-                <w:rPr>
-                  <w:rFonts w:ascii="Cambria Math" w:hAnsi="Cambria Math" w:cs="Times New Roman"/>
-                </w:rPr>
-                <m:t>,</m:t>
-              </m:r>
-              <m:r>
-                <w:rPr>
-                  <w:rFonts w:ascii="Cambria Math" w:hAnsi="Cambria Math" w:cs="Times New Roman"/>
-                </w:rPr>
-                <m:t>t</m:t>
-              </m:r>
-            </m:sub>
-          </m:sSub>
-          <m:r>
-            <m:rPr>
-              <m:sty m:val="p"/>
-            </m:rPr>
-            <w:rPr>
-              <w:rFonts w:ascii="Cambria Math" w:hAnsi="Cambria Math" w:cs="Times New Roman"/>
-            </w:rPr>
-            <m:t>&lt;=9000</m:t>
-          </m:r>
-        </m:oMath>
-      </m:oMathPara>
-    </w:p>
-    <w:p>
-      <w:pPr>
-        <w:spacing w:after="0"/>
-        <w:rPr>
-          <w:rFonts w:ascii="Times New Roman" w:hAnsi="Times New Roman" w:cs="Times New Roman"/>
-        </w:rPr>
-      </w:pPr>
-      <w:r>
-        <w:rPr>
-          <w:rFonts w:ascii="Times New Roman" w:hAnsi="Times New Roman" w:cs="Times New Roman"/>
-        </w:rPr>
-        <w:t xml:space="preserve">The ending storage </w:t>
-      </w:r>
-      <w:r>
-        <w:rPr>
-          <w:rFonts w:ascii="Times New Roman" w:hAnsi="Times New Roman" w:cs="Times New Roman"/>
-        </w:rPr>
-        <w:t xml:space="preserve">(end of august) </w:t>
-      </w:r>
-      <w:r>
-        <w:rPr>
-          <w:rFonts w:ascii="Times New Roman" w:hAnsi="Times New Roman" w:cs="Times New Roman"/>
-        </w:rPr>
-        <w:t>must</w:t>
-      </w:r>
-      <w:r>
-        <w:rPr>
-          <w:rFonts w:ascii="Times New Roman" w:hAnsi="Times New Roman" w:cs="Times New Roman"/>
-        </w:rPr>
-        <w:t xml:space="preserve"> </w:t>
-      </w:r>
-      <w:r>
-        <w:rPr>
-          <w:rFonts w:ascii="Times New Roman" w:hAnsi="Times New Roman" w:cs="Times New Roman"/>
-        </w:rPr>
-        <w:t xml:space="preserve">be </w:t>
-      </w:r>
-      <w:r>
-        <w:rPr>
-          <w:rFonts w:ascii="Times New Roman" w:hAnsi="Times New Roman" w:cs="Times New Roman"/>
-        </w:rPr>
-        <w:t>&gt;</w:t>
-      </w:r>
-      <w:r>
-        <w:rPr>
-          <w:rFonts w:ascii="Times New Roman" w:hAnsi="Times New Roman" w:cs="Times New Roman"/>
-        </w:rPr>
-        <w:t>= 3,000 acre-fe</w:t>
-      </w:r>
-      <w:r>
-        <w:rPr>
-          <w:rFonts w:ascii="Times New Roman" w:hAnsi="Times New Roman" w:cs="Times New Roman"/>
-        </w:rPr>
-        <w:t>et</w:t>
-      </w:r>
-      <w:r>
-        <w:rPr>
-          <w:rFonts w:ascii="Times New Roman" w:hAnsi="Times New Roman" w:cs="Times New Roman"/>
-        </w:rPr>
-        <w:t xml:space="preserve"> (1 constraint)</w:t>
-      </w:r>
-    </w:p>
-    <w:p>
-      <w:pPr>
-        <w:spacing w:after="0"/>
-        <w:rPr>
-          <w:rFonts w:ascii="Times New Roman" w:hAnsi="Times New Roman" w:cs="Times New Roman"/>
-        </w:rPr>
-      </w:pPr>
-      <m:oMathPara>
-        <m:oMath>
-          <m:sSub>
-            <m:sSubPr>
-              <m:ctrlPr>
-                <w:rPr>
-                  <w:rFonts w:ascii="Cambria Math" w:hAnsi="Cambria Math" w:cs="Times New Roman"/>
-                </w:rPr>
-              </m:ctrlPr>
-            </m:sSubPr>
-            <m:e>
-              <m:r>
-                <w:rPr>
-                  <w:rFonts w:ascii="Cambria Math" w:hAnsi="Cambria Math" w:cs="Times New Roman"/>
-                </w:rPr>
-                <m:t>X</m:t>
-              </m:r>
-            </m:e>
-            <m:sub>
-              <m:r>
-                <w:rPr>
-                  <w:rFonts w:ascii="Cambria Math" w:hAnsi="Cambria Math" w:cs="Times New Roman"/>
-                </w:rPr>
-                <m:t>res</m:t>
-              </m:r>
-              <m:r>
-                <m:rPr>
-                  <m:sty m:val="p"/>
-                </m:rPr>
-                <w:rPr>
-                  <w:rFonts w:ascii="Cambria Math" w:hAnsi="Cambria Math" w:cs="Times New Roman"/>
-                </w:rPr>
-                <m:t>,</m:t>
-              </m:r>
-              <m:r>
-                <m:rPr>
-                  <m:sty m:val="p"/>
-                </m:rPr>
-                <w:rPr>
-                  <w:rFonts w:ascii="Cambria Math" w:hAnsi="Cambria Math" w:cs="Times New Roman"/>
-                </w:rPr>
-                <m:t>t</m:t>
-              </m:r>
-            </m:sub>
-          </m:sSub>
-          <m:r>
-            <m:rPr>
-              <m:sty m:val="p"/>
-            </m:rPr>
-            <w:rPr>
-              <w:rFonts w:ascii="Cambria Math" w:hAnsi="Cambria Math" w:cs="Times New Roman"/>
-            </w:rPr>
-            <m:t>&gt;=3000</m:t>
-          </m:r>
-        </m:oMath>
-      </m:oMathPara>
-    </w:p>
-    <w:p>
-      <w:pPr>
-        <w:spacing w:after="0"/>
-        <w:rPr>
-          <w:rFonts w:ascii="Times New Roman" w:hAnsi="Times New Roman" w:cs="Times New Roman"/>
-        </w:rPr>
-      </w:pPr>
-      <w:r>
-        <w:rPr>
-          <w:rFonts w:ascii="Times New Roman" w:hAnsi="Times New Roman" w:cs="Times New Roman"/>
-        </w:rPr>
-        <w:t xml:space="preserve">Inflow </w:t>
-      </w:r>
-      <w:r>
-        <w:rPr>
-          <w:rFonts w:ascii="Times New Roman" w:hAnsi="Times New Roman" w:cs="Times New Roman"/>
-        </w:rPr>
-        <w:t>&gt;</w:t>
-      </w:r>
-      <w:proofErr w:type="gramStart"/>
-      <w:r>
-        <w:rPr>
-          <w:rFonts w:ascii="Times New Roman" w:hAnsi="Times New Roman" w:cs="Times New Roman"/>
-        </w:rPr>
-        <w:t xml:space="preserve">= </w:t>
-      </w:r>
-      <w:r>
-        <w:rPr>
-          <w:rFonts w:ascii="Times New Roman" w:hAnsi="Times New Roman" w:cs="Times New Roman"/>
-        </w:rPr>
-        <w:t xml:space="preserve"> Change</w:t>
-      </w:r>
-      <w:proofErr w:type="gramEnd"/>
-      <w:r>
-        <w:rPr>
-          <w:rFonts w:ascii="Times New Roman" w:hAnsi="Times New Roman" w:cs="Times New Roman"/>
-        </w:rPr>
-        <w:t xml:space="preserve"> in Storage + </w:t>
-      </w:r>
-      <w:r>
-        <w:rPr>
-          <w:rFonts w:ascii="Times New Roman" w:hAnsi="Times New Roman" w:cs="Times New Roman"/>
-        </w:rPr>
-        <w:t xml:space="preserve">spill + irrigation </w:t>
-      </w:r>
-    </w:p>
-    <w:p>
-      <w:pPr>
-        <w:spacing w:after="0"/>
-        <w:rPr>
-          <w:rFonts w:ascii="Times New Roman" w:hAnsi="Times New Roman" w:cs="Times New Roman"/>
-        </w:rPr>
-      </w:pPr>
-      <w:proofErr w:type="gramStart"/>
-      <w:r>
-        <w:rPr>
-          <w:rFonts w:ascii="Times New Roman" w:hAnsi="Times New Roman" w:cs="Times New Roman"/>
-        </w:rPr>
-        <w:t>Change  in</w:t>
-      </w:r>
-      <w:proofErr w:type="gramEnd"/>
-      <w:r>
-        <w:rPr>
-          <w:rFonts w:ascii="Times New Roman" w:hAnsi="Times New Roman" w:cs="Times New Roman"/>
-        </w:rPr>
-        <w:t xml:space="preserve"> Storage = Inflow – Outflow for each time step</w:t>
-      </w:r>
-    </w:p>
-    <w:p>
-      <w:pPr>
-        <w:spacing w:after="0"/>
-        <w:rPr>
-          <w:rFonts w:ascii="Times New Roman" w:hAnsi="Times New Roman" w:cs="Times New Roman"/>
-        </w:rPr>
-      </w:pPr>
-      <m:oMathPara>
-        <m:oMath>
-          <m:sSub>
-            <m:sSubPr>
-              <m:ctrlPr>
-                <w:rPr>
-                  <w:rFonts w:ascii="Cambria Math" w:hAnsi="Cambria Math" w:cs="Times New Roman"/>
-                </w:rPr>
-              </m:ctrlPr>
-            </m:sSubPr>
-            <m:e>
-              <m:r>
-                <w:rPr>
-                  <w:rFonts w:ascii="Cambria Math" w:hAnsi="Cambria Math" w:cs="Times New Roman"/>
-                </w:rPr>
-                <m:t>X</m:t>
-              </m:r>
-            </m:e>
-            <m:sub>
-              <m:r>
-                <w:rPr>
-                  <w:rFonts w:ascii="Cambria Math" w:hAnsi="Cambria Math" w:cs="Times New Roman"/>
-                </w:rPr>
-                <m:t>res</m:t>
-              </m:r>
-              <m:r>
-                <m:rPr>
-                  <m:sty m:val="p"/>
-                </m:rPr>
-                <w:rPr>
-                  <w:rFonts w:ascii="Cambria Math" w:hAnsi="Cambria Math" w:cs="Times New Roman"/>
-                </w:rPr>
-                <m:t>,</m:t>
-              </m:r>
-              <m:r>
-                <w:rPr>
-                  <w:rFonts w:ascii="Cambria Math" w:hAnsi="Cambria Math" w:cs="Times New Roman"/>
-                </w:rPr>
-                <m:t>a</m:t>
-              </m:r>
-            </m:sub>
-          </m:sSub>
-          <m:r>
-            <m:rPr>
-              <m:sty m:val="p"/>
-            </m:rPr>
-            <w:rPr>
-              <w:rFonts w:ascii="Cambria Math" w:hAnsi="Cambria Math" w:cs="Times New Roman"/>
-            </w:rPr>
-            <m:t>-3000=</m:t>
-          </m:r>
-          <m:sSub>
-            <m:sSubPr>
-              <m:ctrlPr>
-                <w:rPr>
-                  <w:rFonts w:ascii="Cambria Math" w:hAnsi="Cambria Math" w:cs="Times New Roman"/>
-                </w:rPr>
-              </m:ctrlPr>
-            </m:sSubPr>
-            <m:e>
-              <m:r>
-                <w:rPr>
-                  <w:rFonts w:ascii="Cambria Math" w:hAnsi="Cambria Math" w:cs="Times New Roman"/>
-                </w:rPr>
-                <m:t>I</m:t>
-              </m:r>
-            </m:e>
-            <m:sub>
-              <m:r>
-                <w:rPr>
-                  <w:rFonts w:ascii="Cambria Math" w:hAnsi="Cambria Math" w:cs="Times New Roman"/>
-                </w:rPr>
-                <m:t>a</m:t>
-              </m:r>
-            </m:sub>
-          </m:sSub>
-          <m:r>
-            <m:rPr>
-              <m:sty m:val="p"/>
-            </m:rPr>
-            <w:rPr>
-              <w:rFonts w:ascii="Cambria Math" w:hAnsi="Cambria Math" w:cs="Times New Roman"/>
-            </w:rPr>
-            <m:t>-</m:t>
-          </m:r>
-          <m:sSub>
-            <m:sSubPr>
-              <m:ctrlPr>
-                <w:rPr>
-                  <w:rFonts w:ascii="Cambria Math" w:hAnsi="Cambria Math" w:cs="Times New Roman"/>
-                </w:rPr>
-              </m:ctrlPr>
-            </m:sSubPr>
-            <m:e>
-              <m:r>
-                <w:rPr>
-                  <w:rFonts w:ascii="Cambria Math" w:hAnsi="Cambria Math" w:cs="Times New Roman"/>
-                </w:rPr>
-                <m:t>X</m:t>
-              </m:r>
-            </m:e>
-            <m:sub>
-              <m:r>
-                <w:rPr>
-                  <w:rFonts w:ascii="Cambria Math" w:hAnsi="Cambria Math" w:cs="Times New Roman"/>
-                </w:rPr>
-                <m:t>div</m:t>
-              </m:r>
-              <m:r>
-                <m:rPr>
-                  <m:sty m:val="p"/>
-                </m:rPr>
-                <w:rPr>
-                  <w:rFonts w:ascii="Cambria Math" w:hAnsi="Cambria Math" w:cs="Times New Roman"/>
-                </w:rPr>
-                <m:t>,</m:t>
-              </m:r>
-              <m:r>
-                <w:rPr>
-                  <w:rFonts w:ascii="Cambria Math" w:hAnsi="Cambria Math" w:cs="Times New Roman"/>
-                </w:rPr>
-                <m:t>a</m:t>
-              </m:r>
-            </m:sub>
-          </m:sSub>
-          <m:r>
-            <m:rPr>
-              <m:sty m:val="p"/>
-            </m:rPr>
-            <w:rPr>
-              <w:rFonts w:ascii="Cambria Math" w:hAnsi="Cambria Math" w:cs="Times New Roman"/>
-            </w:rPr>
-            <m:t>-</m:t>
-          </m:r>
-          <m:sSub>
-            <m:sSubPr>
-              <m:ctrlPr>
-                <w:rPr>
-                  <w:rFonts w:ascii="Cambria Math" w:hAnsi="Cambria Math" w:cs="Times New Roman"/>
-                </w:rPr>
-              </m:ctrlPr>
-            </m:sSubPr>
-            <m:e>
-              <m:r>
-                <w:rPr>
-                  <w:rFonts w:ascii="Cambria Math" w:hAnsi="Cambria Math" w:cs="Times New Roman"/>
-                </w:rPr>
-                <m:t>X</m:t>
-              </m:r>
-            </m:e>
-            <m:sub>
-              <m:r>
-                <w:rPr>
-                  <w:rFonts w:ascii="Cambria Math" w:hAnsi="Cambria Math" w:cs="Times New Roman"/>
-                </w:rPr>
-                <m:t>spill</m:t>
-              </m:r>
-              <m:r>
-                <m:rPr>
-                  <m:sty m:val="p"/>
-                </m:rPr>
-                <w:rPr>
-                  <w:rFonts w:ascii="Cambria Math" w:hAnsi="Cambria Math" w:cs="Times New Roman"/>
-                </w:rPr>
-                <m:t>,</m:t>
-              </m:r>
-              <m:r>
-                <w:rPr>
-                  <w:rFonts w:ascii="Cambria Math" w:hAnsi="Cambria Math" w:cs="Times New Roman"/>
-                </w:rPr>
-                <m:t>a</m:t>
-              </m:r>
-            </m:sub>
-          </m:sSub>
-        </m:oMath>
-      </m:oMathPara>
-    </w:p>
-    <w:p>
-      <w:pPr>
-        <w:spacing w:after="0"/>
-        <w:rPr>
-          <w:rFonts w:ascii="Times New Roman" w:eastAsiaTheme="minorEastAsia" w:hAnsi="Times New Roman" w:cs="Times New Roman"/>
-        </w:rPr>
-      </w:pPr>
-      <m:oMathPara>
-        <m:oMath>
-          <m:sSub>
-            <m:sSubPr>
-              <m:ctrlPr>
-                <w:rPr>
-                  <w:rFonts w:ascii="Cambria Math" w:hAnsi="Cambria Math" w:cs="Times New Roman"/>
-                </w:rPr>
-              </m:ctrlPr>
-            </m:sSubPr>
-            <m:e>
-              <m:r>
-                <w:rPr>
-                  <w:rFonts w:ascii="Cambria Math" w:hAnsi="Cambria Math" w:cs="Times New Roman"/>
-                </w:rPr>
-                <m:t>X</m:t>
-              </m:r>
-            </m:e>
-            <m:sub>
-              <m:r>
-                <w:rPr>
-                  <w:rFonts w:ascii="Cambria Math" w:hAnsi="Cambria Math" w:cs="Times New Roman"/>
-                </w:rPr>
-                <m:t>res</m:t>
-              </m:r>
-              <m:r>
-                <m:rPr>
-                  <m:sty m:val="p"/>
-                </m:rPr>
-                <w:rPr>
-                  <w:rFonts w:ascii="Cambria Math" w:hAnsi="Cambria Math" w:cs="Times New Roman"/>
-                </w:rPr>
-                <m:t>,t</m:t>
-              </m:r>
-            </m:sub>
-          </m:sSub>
-          <m:r>
-            <m:rPr>
-              <m:sty m:val="p"/>
-            </m:rPr>
-            <w:rPr>
-              <w:rFonts w:ascii="Cambria Math" w:hAnsi="Cambria Math" w:cs="Times New Roman"/>
-            </w:rPr>
-            <m:t>-</m:t>
-          </m:r>
-          <m:sSub>
-            <m:sSubPr>
-              <m:ctrlPr>
-                <w:rPr>
-                  <w:rFonts w:ascii="Cambria Math" w:hAnsi="Cambria Math" w:cs="Times New Roman"/>
-                </w:rPr>
-              </m:ctrlPr>
-            </m:sSubPr>
-            <m:e>
-              <m:r>
-                <w:rPr>
-                  <w:rFonts w:ascii="Cambria Math" w:hAnsi="Cambria Math" w:cs="Times New Roman"/>
-                </w:rPr>
-                <m:t>X</m:t>
-              </m:r>
-            </m:e>
-            <m:sub>
-              <m:r>
-                <w:rPr>
-                  <w:rFonts w:ascii="Cambria Math" w:hAnsi="Cambria Math" w:cs="Times New Roman"/>
-                </w:rPr>
-                <m:t>res</m:t>
-              </m:r>
-              <m:r>
-                <m:rPr>
-                  <m:sty m:val="p"/>
-                </m:rPr>
-                <w:rPr>
-                  <w:rFonts w:ascii="Cambria Math" w:hAnsi="Cambria Math" w:cs="Times New Roman"/>
-                </w:rPr>
-                <m:t>,t-1</m:t>
-              </m:r>
-            </m:sub>
-          </m:sSub>
-          <m:r>
-            <m:rPr>
-              <m:sty m:val="p"/>
-            </m:rPr>
-            <w:rPr>
-              <w:rFonts w:ascii="Cambria Math" w:hAnsi="Cambria Math" w:cs="Times New Roman"/>
-            </w:rPr>
-            <m:t>=</m:t>
-          </m:r>
-          <m:sSub>
-            <m:sSubPr>
-              <m:ctrlPr>
-                <w:rPr>
-                  <w:rFonts w:ascii="Cambria Math" w:hAnsi="Cambria Math" w:cs="Times New Roman"/>
-                </w:rPr>
-              </m:ctrlPr>
-            </m:sSubPr>
-            <m:e>
-              <m:r>
-                <w:rPr>
-                  <w:rFonts w:ascii="Cambria Math" w:hAnsi="Cambria Math" w:cs="Times New Roman"/>
-                </w:rPr>
-                <m:t>I</m:t>
-              </m:r>
-            </m:e>
-            <m:sub>
-              <m:r>
-                <m:rPr>
-                  <m:sty m:val="p"/>
-                </m:rPr>
-                <w:rPr>
-                  <w:rFonts w:ascii="Cambria Math" w:hAnsi="Cambria Math" w:cs="Times New Roman"/>
-                </w:rPr>
-                <m:t>t</m:t>
-              </m:r>
-            </m:sub>
-          </m:sSub>
-          <m:r>
-            <m:rPr>
-              <m:sty m:val="p"/>
-            </m:rPr>
-            <w:rPr>
-              <w:rFonts w:ascii="Cambria Math" w:hAnsi="Cambria Math" w:cs="Times New Roman"/>
-            </w:rPr>
-            <m:t>-</m:t>
-          </m:r>
-          <m:sSub>
-            <m:sSubPr>
-              <m:ctrlPr>
-                <w:rPr>
-                  <w:rFonts w:ascii="Cambria Math" w:hAnsi="Cambria Math" w:cs="Times New Roman"/>
-                </w:rPr>
-              </m:ctrlPr>
-            </m:sSubPr>
-            <m:e>
-              <m:r>
-                <w:rPr>
-                  <w:rFonts w:ascii="Cambria Math" w:hAnsi="Cambria Math" w:cs="Times New Roman"/>
-                </w:rPr>
-                <m:t>X</m:t>
-              </m:r>
-            </m:e>
-            <m:sub>
-              <m:r>
-                <w:rPr>
-                  <w:rFonts w:ascii="Cambria Math" w:hAnsi="Cambria Math" w:cs="Times New Roman"/>
-                </w:rPr>
-                <m:t>div</m:t>
-              </m:r>
-              <m:r>
-                <m:rPr>
-                  <m:sty m:val="p"/>
-                </m:rPr>
-                <w:rPr>
-                  <w:rFonts w:ascii="Cambria Math" w:hAnsi="Cambria Math" w:cs="Times New Roman"/>
-                </w:rPr>
-                <m:t>,t</m:t>
-              </m:r>
-            </m:sub>
-          </m:sSub>
-          <m:r>
-            <m:rPr>
-              <m:sty m:val="p"/>
-            </m:rPr>
-            <w:rPr>
-              <w:rFonts w:ascii="Cambria Math" w:hAnsi="Cambria Math" w:cs="Times New Roman"/>
-            </w:rPr>
-            <m:t>-</m:t>
-          </m:r>
-          <m:sSub>
-            <m:sSubPr>
-              <m:ctrlPr>
-                <w:rPr>
-                  <w:rFonts w:ascii="Cambria Math" w:hAnsi="Cambria Math" w:cs="Times New Roman"/>
-                </w:rPr>
-              </m:ctrlPr>
-            </m:sSubPr>
-            <m:e>
-              <m:r>
-                <w:rPr>
-                  <w:rFonts w:ascii="Cambria Math" w:hAnsi="Cambria Math" w:cs="Times New Roman"/>
-                </w:rPr>
-                <m:t>X</m:t>
-              </m:r>
-            </m:e>
-            <m:sub>
-              <m:r>
-                <w:rPr>
-                  <w:rFonts w:ascii="Cambria Math" w:hAnsi="Cambria Math" w:cs="Times New Roman"/>
-                </w:rPr>
-                <m:t>spill</m:t>
-              </m:r>
-              <m:r>
-                <m:rPr>
-                  <m:sty m:val="p"/>
-                </m:rPr>
-                <w:rPr>
-                  <w:rFonts w:ascii="Cambria Math" w:hAnsi="Cambria Math" w:cs="Times New Roman"/>
-                </w:rPr>
-                <m:t>,t</m:t>
-              </m:r>
-            </m:sub>
-          </m:sSub>
-        </m:oMath>
-      </m:oMathPara>
-    </w:p>
-    <w:p>
-      <w:pPr>
-        <w:rPr>
-          <w:rFonts w:ascii="Times New Roman" w:eastAsiaTheme="minorEastAsia" w:hAnsi="Times New Roman" w:cs="Times New Roman"/>
-        </w:rPr>
-      </w:pPr>
-      <w:r>
-        <w:rPr>
-          <w:rFonts w:ascii="Times New Roman" w:eastAsiaTheme="minorEastAsia" w:hAnsi="Times New Roman" w:cs="Times New Roman"/>
+        <w:t>I used AI</w:t>
+      </w:r>
+      <w:r>
+        <w:rPr>
+          <w:rFonts w:ascii="Times New Roman" w:hAnsi="Times New Roman" w:cs="Times New Roman"/>
+        </w:rPr>
+        <w:t xml:space="preserve"> (Gemini)</w:t>
+      </w:r>
+      <w:r>
+        <w:rPr>
+          <w:rFonts w:ascii="Times New Roman" w:hAnsi="Times New Roman" w:cs="Times New Roman"/>
+        </w:rPr>
+        <w:t xml:space="preserve"> to help me fix </w:t>
+      </w:r>
+      <w:r>
+        <w:rPr>
+          <w:rFonts w:ascii="Times New Roman" w:hAnsi="Times New Roman" w:cs="Times New Roman"/>
+        </w:rPr>
+        <w:t xml:space="preserve">some errors in my GAMS. </w:t>
+      </w:r>
+      <w:r>
+        <w:rPr>
+          <w:rFonts w:ascii="Times New Roman" w:hAnsi="Times New Roman" w:cs="Times New Roman"/>
+        </w:rPr>
+        <w:t xml:space="preserve">I was having a hard time using the $ operator in GAMS and I couldn’t figure out the syntax. AI helped me understand </w:t>
+      </w:r>
+      <w:r>
+        <w:rPr>
+          <w:rFonts w:ascii="Times New Roman" w:hAnsi="Times New Roman" w:cs="Times New Roman"/>
+        </w:rPr>
+        <w:t xml:space="preserve">how the syntax works. This follows the AI policy because I did not copy and paste anything from AI into my GAMS. I did not let AI govern any decision I made in my model. Here is the AI chat: </w:t>
+      </w:r>
+      <w:hyperlink r:id="rId8" w:history="1">
+        <w:r>
+          <w:rPr>
+            <w:rStyle w:val="Hyperlink"/>
+            <w:rFonts w:ascii="Times New Roman" w:hAnsi="Times New Roman" w:cs="Times New Roman"/>
+          </w:rPr>
+          <w:t>https://share.gemini.google/kPXsfVZFl82a</w:t>
+        </w:r>
+      </w:hyperlink>
+    </w:p>
+    <w:p>
+      <w:pPr>
+        <w:rPr>
+          <w:rFonts w:ascii="Times New Roman" w:hAnsi="Times New Roman" w:cs="Times New Roman"/>
+        </w:rPr>
+      </w:pPr>
+      <w:r>
+        <w:rPr>
+          <w:rFonts w:ascii="Times New Roman" w:hAnsi="Times New Roman" w:cs="Times New Roman"/>
         </w:rPr>
         <w:br w:type="page"/>
       </w:r>
     </w:p>
-    <w:p>
-      <w:pPr>
-        <w:spacing w:after="0"/>
-        <w:rPr>
-          <w:rFonts w:ascii="Times New Roman" w:hAnsi="Times New Roman" w:cs="Times New Roman"/>
-        </w:rPr>
-      </w:pPr>
-      <w:r>
-        <w:rPr>
-          <w:rFonts w:ascii="Times New Roman" w:hAnsi="Times New Roman" w:cs="Times New Roman"/>
-        </w:rPr>
-        <w:lastRenderedPageBreak/>
-        <w:t>References</w:t>
-      </w:r>
-    </w:p>
-    <w:p>
-      <w:pPr>
-        <w:spacing w:after="0"/>
-        <w:rPr>
-          <w:rFonts w:ascii="Times New Roman" w:hAnsi="Times New Roman" w:cs="Times New Roman"/>
-        </w:rPr>
-      </w:pPr>
-    </w:p>
-    <w:p>
-      <w:pPr>
-        <w:spacing w:after="0"/>
-        <w:rPr>
-          <w:rFonts w:ascii="Times New Roman" w:hAnsi="Times New Roman" w:cs="Times New Roman"/>
-        </w:rPr>
-      </w:pPr>
-      <w:r>
-        <w:rPr>
-          <w:rFonts w:ascii="Times New Roman" w:hAnsi="Times New Roman" w:cs="Times New Roman"/>
-        </w:rPr>
-        <w:t>GAMS Development Corporation. (202</w:t>
-      </w:r>
-      <w:r>
-        <w:rPr>
-          <w:rFonts w:ascii="Times New Roman" w:hAnsi="Times New Roman" w:cs="Times New Roman"/>
-        </w:rPr>
-        <w:t>6</w:t>
-      </w:r>
-      <w:r>
-        <w:rPr>
-          <w:rFonts w:ascii="Times New Roman" w:hAnsi="Times New Roman" w:cs="Times New Roman"/>
-        </w:rPr>
-        <w:t xml:space="preserve">). General Algebraic Modeling System (GAMS) (Release </w:t>
-      </w:r>
-      <w:r>
-        <w:rPr>
-          <w:rFonts w:ascii="Times New Roman" w:hAnsi="Times New Roman" w:cs="Times New Roman"/>
-        </w:rPr>
-        <w:t>54</w:t>
-      </w:r>
-      <w:r>
-        <w:rPr>
-          <w:rFonts w:ascii="Times New Roman" w:hAnsi="Times New Roman" w:cs="Times New Roman"/>
-        </w:rPr>
-        <w:t>.</w:t>
-      </w:r>
-      <w:r>
-        <w:rPr>
-          <w:rFonts w:ascii="Times New Roman" w:hAnsi="Times New Roman" w:cs="Times New Roman"/>
-        </w:rPr>
-        <w:t>4</w:t>
-      </w:r>
-      <w:r>
-        <w:rPr>
-          <w:rFonts w:ascii="Times New Roman" w:hAnsi="Times New Roman" w:cs="Times New Roman"/>
-        </w:rPr>
-        <w:t xml:space="preserve">.0) [Computer software]. </w:t>
-      </w:r>
-      <w:r>
-        <w:rPr>
-          <w:rFonts w:ascii="Times New Roman" w:hAnsi="Times New Roman" w:cs="Times New Roman"/>
-          <w:color w:val="45B0E1" w:themeColor="accent1" w:themeTint="99"/>
-          <w:u w:val="single"/>
-        </w:rPr>
-        <w:fldChar w:fldCharType="begin"/>
-      </w:r>
-      <w:r>
-        <w:rPr>
-          <w:rFonts w:ascii="Times New Roman" w:hAnsi="Times New Roman" w:cs="Times New Roman"/>
-          <w:color w:val="45B0E1" w:themeColor="accent1" w:themeTint="99"/>
-          <w:u w:val="single"/>
-        </w:rPr>
-        <w:instrText>HYPERLINK "https://www.gams.com/" \t "_blank"</w:instrText>
-      </w:r>
-      <w:r>
-        <w:rPr>
-          <w:rFonts w:ascii="Times New Roman" w:hAnsi="Times New Roman" w:cs="Times New Roman"/>
-          <w:color w:val="45B0E1" w:themeColor="accent1" w:themeTint="99"/>
-          <w:u w:val="single"/>
-        </w:rPr>
-      </w:r>
-      <w:r>
-        <w:rPr>
-          <w:rFonts w:ascii="Times New Roman" w:hAnsi="Times New Roman" w:cs="Times New Roman"/>
-          <w:color w:val="45B0E1" w:themeColor="accent1" w:themeTint="99"/>
-          <w:u w:val="single"/>
-        </w:rPr>
-        <w:fldChar w:fldCharType="separate"/>
-      </w:r>
-      <w:r>
-        <w:rPr>
-          <w:rFonts w:ascii="Times New Roman" w:hAnsi="Times New Roman" w:cs="Times New Roman"/>
-          <w:color w:val="45B0E1" w:themeColor="accent1" w:themeTint="99"/>
-          <w:u w:val="single"/>
-        </w:rPr>
-        <w:t>https://www.gams.com/</w:t>
-      </w:r>
-      <w:r>
-        <w:rPr>
-          <w:rFonts w:ascii="Times New Roman" w:hAnsi="Times New Roman" w:cs="Times New Roman"/>
-          <w:color w:val="45B0E1" w:themeColor="accent1" w:themeTint="99"/>
-          <w:u w:val="single"/>
-        </w:rPr>
-        <w:fldChar w:fldCharType="end"/>
-      </w:r>
-    </w:p>
     <w:sectPr>
-      <w:footerReference w:type="even" r:id="rId8"/>
-      <w:footerReference w:type="default" r:id="rId9"/>
+      <w:footerReference w:type="even" r:id="rId9"/>
+      <w:footerReference w:type="default" r:id="rId10"/>
       <w:pgSz w:w="12240" w:h="15840"/>
       <w:pgMar w:top="1440" w:right="1440" w:bottom="1440" w:left="1440" w:header="720" w:footer="720" w:gutter="0"/>
       <w:cols w:space="720"/>
@@ -3143,6 +2912,11 @@
         <w:docPartUnique/>
       </w:docPartObj>
     </w:sdtPr>
+    <w:sdtEndPr>
+      <w:rPr>
+        <w:rStyle w:val="PageNumber"/>
+      </w:rPr>
+    </w:sdtEndPr>
     <w:sdtContent>
       <w:p>
         <w:pPr>
@@ -3200,6 +2974,11 @@
         <w:docPartUnique/>
       </w:docPartObj>
     </w:sdtPr>
+    <w:sdtEndPr>
+      <w:rPr>
+        <w:rStyle w:val="PageNumber"/>
+      </w:rPr>
+    </w:sdtEndPr>
     <w:sdtContent>
       <w:p>
         <w:pPr>
@@ -4487,12 +4266,77 @@
     <w:name w:val="Hyperlink"/>
     <w:basedOn w:val="DefaultParagraphFont"/>
     <w:uiPriority w:val="99"/>
-    <w:semiHidden/>
     <w:unhideWhenUsed/>
     <w:rsid w:val="006F50FE"/>
     <w:rPr>
       <w:color w:val="0000FF"/>
       <w:u w:val="single"/>
+    </w:rPr>
+  </w:style>
+  <w:style w:type="table" w:styleId="TableGrid">
+    <w:name w:val="Table Grid"/>
+    <w:basedOn w:val="TableNormal"/>
+    <w:uiPriority w:val="39"/>
+    <w:rsid w:val="00464AFF"/>
+    <w:pPr>
+      <w:spacing w:after="0" w:line="240" w:lineRule="auto"/>
+    </w:pPr>
+    <w:tblPr>
+      <w:tblBorders>
+        <w:top w:val="single" w:sz="4" w:space="0" w:color="auto"/>
+        <w:left w:val="single" w:sz="4" w:space="0" w:color="auto"/>
+        <w:bottom w:val="single" w:sz="4" w:space="0" w:color="auto"/>
+        <w:right w:val="single" w:sz="4" w:space="0" w:color="auto"/>
+        <w:insideH w:val="single" w:sz="4" w:space="0" w:color="auto"/>
+        <w:insideV w:val="single" w:sz="4" w:space="0" w:color="auto"/>
+      </w:tblBorders>
+    </w:tblPr>
+  </w:style>
+  <w:style w:type="paragraph" w:styleId="NormalWeb">
+    <w:name w:val="Normal (Web)"/>
+    <w:basedOn w:val="Normal"/>
+    <w:uiPriority w:val="99"/>
+    <w:semiHidden/>
+    <w:unhideWhenUsed/>
+    <w:rsid w:val="00303138"/>
+    <w:pPr>
+      <w:spacing w:before="100" w:beforeAutospacing="1" w:after="100" w:afterAutospacing="1" w:line="240" w:lineRule="auto"/>
+    </w:pPr>
+    <w:rPr>
+      <w:rFonts w:ascii="Times New Roman" w:eastAsia="Times New Roman" w:hAnsi="Times New Roman" w:cs="Times New Roman"/>
+      <w:kern w:val="0"/>
+      <w14:ligatures w14:val="none"/>
+    </w:rPr>
+  </w:style>
+  <w:style w:type="paragraph" w:styleId="Caption">
+    <w:name w:val="caption"/>
+    <w:basedOn w:val="Normal"/>
+    <w:next w:val="Normal"/>
+    <w:uiPriority w:val="35"/>
+    <w:unhideWhenUsed/>
+    <w:qFormat/>
+    <w:rsid w:val="0005613A"/>
+    <w:pPr>
+      <w:spacing w:after="200" w:line="240" w:lineRule="auto"/>
+    </w:pPr>
+    <w:rPr>
+      <w:i/>
+      <w:iCs/>
+      <w:color w:val="0E2841" w:themeColor="text2"/>
+      <w:sz w:val="18"/>
+      <w:szCs w:val="18"/>
+    </w:rPr>
+  </w:style>
+  <w:style w:type="character" w:styleId="UnresolvedMention">
+    <w:name w:val="Unresolved Mention"/>
+    <w:basedOn w:val="DefaultParagraphFont"/>
+    <w:uiPriority w:val="99"/>
+    <w:semiHidden/>
+    <w:unhideWhenUsed/>
+    <w:rsid w:val="00A10A62"/>
+    <w:rPr>
+      <w:color w:val="605E5C"/>
+      <w:shd w:val="clear" w:color="auto" w:fill="E1DFDD"/>
     </w:rPr>
   </w:style>
 </w:styles>

</xml_diff>